<commit_message>
docs: update guide with architecture explanations and simplified AWS instructions
</commit_message>
<xml_diff>
--- a/Documentacion/GUIA_DESPLIEGUE_AWS_EC2.docx
+++ b/Documentacion/GUIA_DESPLIEGUE_AWS_EC2.docx
@@ -14,19 +14,19 @@
           <w:color w:val="104B8E"/>
           <w:sz w:val="44"/>
         </w:rPr>
-        <w:t>Guía de Despliegue en AWS EC2</w:t>
+        <w:t>Guía del Proyecto y Despliegue en AWS EC2</w:t>
       </w:r>
     </w:p>
     <w:p>
       <w:pPr>
-        <w:spacing w:after="400"/>
+        <w:spacing w:after="320"/>
         <w:jc w:val="center"/>
       </w:pPr>
       <w:r>
         <w:rPr>
           <w:rFonts w:ascii="Segoe UI" w:hAnsi="Segoe UI"/>
           <w:color w:val="6C757D"/>
-          <w:sz w:val="24"/>
+          <w:sz w:val="23"/>
         </w:rPr>
         <w:t>Proyecto: HuertoHogar (React + Bootstrap) | Asignatura: DSY1104 Desarrollo Full Stack II</w:t>
       </w:r>
@@ -34,95 +34,38 @@
     <w:p>
       <w:pPr>
         <w:keepNext/>
-        <w:spacing w:before="320" w:after="120"/>
+        <w:spacing w:before="280" w:after="120"/>
       </w:pPr>
       <w:r>
         <w:rPr>
           <w:rFonts w:ascii="Segoe UI" w:hAnsi="Segoe UI"/>
           <w:b/>
           <w:color w:val="104B8E"/>
-          <w:sz w:val="30"/>
+          <w:sz w:val="28"/>
         </w:rPr>
-        <w:t>1. ¿Qué es esa IP y por qué se usa?</w:t>
+        <w:t>1. Estructura y Funcionamiento del Proyecto (¿Qué es cada cosa?)</w:t>
       </w:r>
     </w:p>
     <w:p>
       <w:pPr>
-        <w:spacing w:after="120" w:line="276" w:lineRule="auto"/>
+        <w:spacing w:after="100" w:line="276" w:lineRule="auto"/>
       </w:pPr>
       <w:r>
         <w:rPr>
           <w:rFonts w:ascii="Segoe UI" w:hAnsi="Segoe UI"/>
           <w:b/>
           <w:color w:val="212529"/>
-          <w:sz w:val="21"/>
+          <w:sz w:val="20"/>
         </w:rPr>
-        <w:t xml:space="preserve">• Dirección IPv4 Pública: </w:t>
+        <w:t xml:space="preserve">Resumen de arquitectura: </w:t>
       </w:r>
       <w:r>
         <w:rPr>
           <w:rFonts w:ascii="Segoe UI" w:hAnsi="Segoe UI"/>
           <w:color w:val="212529"/>
-          <w:sz w:val="21"/>
+          <w:sz w:val="20"/>
         </w:rPr>
-        <w:t>Cada vez que creas una máquina virtual (servidor EC2) en la nube de Amazon Web Services, AWS le asigna automáticamente una Dirección IPv4 Pública (en nuestro caso fue 34.230.35.62). Esta dirección es única en el mundo y funciona como el número de teléfono o la dirección postal de tu servidor en internet.</w:t>
-      </w:r>
-    </w:p>
-    <w:p>
-      <w:pPr>
-        <w:spacing w:after="120" w:line="276" w:lineRule="auto"/>
-      </w:pPr>
-      <w:r>
-        <w:rPr>
-          <w:rFonts w:ascii="Segoe UI" w:hAnsi="Segoe UI"/>
-          <w:b/>
-          <w:color w:val="212529"/>
-          <w:sz w:val="21"/>
-        </w:rPr>
-        <w:t xml:space="preserve">• Puerto (:3000): </w:t>
-      </w:r>
-      <w:r>
-        <w:rPr>
-          <w:rFonts w:ascii="Segoe UI" w:hAnsi="Segoe UI"/>
-          <w:color w:val="212529"/>
-          <w:sz w:val="21"/>
-        </w:rPr>
-        <w:t>Los servidores ejecutan múltiples programas a la vez. El número de puerto le indica a internet con cuál aplicación comunicarse. Configuramos React para escuchar específicamente en el puerto 3000.</w:t>
-      </w:r>
-    </w:p>
-    <w:p>
-      <w:pPr>
-        <w:spacing w:after="120" w:line="276" w:lineRule="auto"/>
-      </w:pPr>
-      <w:r>
-        <w:rPr>
-          <w:rFonts w:ascii="Segoe UI" w:hAnsi="Segoe UI"/>
-          <w:b/>
-          <w:color w:val="212529"/>
-          <w:sz w:val="21"/>
-        </w:rPr>
-        <w:t xml:space="preserve">• IP Pública vs IP Privada: </w:t>
-      </w:r>
-      <w:r>
-        <w:rPr>
-          <w:rFonts w:ascii="Segoe UI" w:hAnsi="Segoe UI"/>
-          <w:color w:val="212529"/>
-          <w:sz w:val="21"/>
-        </w:rPr>
-        <w:t>Es la que abre en internet para ti, tu profesor o cualquier persona desde cualquier dispositivo.</w:t>
-      </w:r>
-    </w:p>
-    <w:p>
-      <w:pPr>
-        <w:spacing w:after="120" w:line="276" w:lineRule="auto"/>
-      </w:pPr>
-      <w:r>
-        <w:rPr>
-          <w:rFonts w:ascii="Segoe UI" w:hAnsi="Segoe UI"/>
-          <w:color w:val="212529"/>
-          <w:sz w:val="21"/>
-        </w:rPr>
-        <w:t>La IP privada (172.31.23.247) solo sirve para redes internas de Amazon; si intentas abrirla en el navegador marcará error porque no existe en la red pública.</w:t>
+        <w:t>A continuación se detalla para qué sirve cada carpeta y archivo principal dentro de la aplicación:</w:t>
       </w:r>
     </w:p>
     <w:tbl>
@@ -133,40 +76,689 @@
         <w:tblLook w:firstColumn="1" w:firstRow="1" w:lastColumn="0" w:lastRow="0" w:noHBand="0" w:noVBand="1" w:val="04A0"/>
       </w:tblPr>
       <w:tblGrid>
-        <w:gridCol w:w="9792"/>
+        <w:gridCol w:w="2592"/>
+        <w:gridCol w:w="2304"/>
+        <w:gridCol w:w="4896"/>
       </w:tblGrid>
       <w:tr>
         <w:tc>
           <w:tcPr>
-            <w:tcW w:type="dxa" w:w="9936"/>
-            <w:shd w:fill="FFF3CD"/>
+            <w:tcW w:type="dxa" w:w="3312"/>
+            <w:shd w:fill="104B8E"/>
             <w:tcMar>
-              <w:top w:w="140" w:type="dxa"/>
-              <w:bottom w:w="140" w:type="dxa"/>
-              <w:left w:w="180" w:type="dxa"/>
-              <w:right w:w="180" w:type="dxa"/>
+              <w:top w:w="80" w:type="dxa"/>
+              <w:bottom w:w="80" w:type="dxa"/>
+              <w:left w:w="100" w:type="dxa"/>
+              <w:right w:w="100" w:type="dxa"/>
             </w:tcMar>
           </w:tcPr>
           <w:p>
-            <w:pPr>
-              <w:spacing w:after="40"/>
-            </w:pPr>
             <w:r>
               <w:rPr>
                 <w:rFonts w:ascii="Segoe UI" w:hAnsi="Segoe UI"/>
                 <w:b/>
-                <w:color w:val="104B8E"/>
-                <w:sz w:val="20"/>
+                <w:color w:val="FFFFFF"/>
+                <w:sz w:val="19"/>
               </w:rPr>
-              <w:t xml:space="preserve">📌 ADVERTENCIA DE LABORATORIO (AWS ACADEMY): </w:t>
+              <w:t>Elemento / Carpeta</w:t>
             </w:r>
+          </w:p>
+        </w:tc>
+        <w:tc>
+          <w:tcPr>
+            <w:tcW w:type="dxa" w:w="3312"/>
+            <w:shd w:fill="104B8E"/>
+            <w:tcMar>
+              <w:top w:w="80" w:type="dxa"/>
+              <w:bottom w:w="80" w:type="dxa"/>
+              <w:left w:w="100" w:type="dxa"/>
+              <w:right w:w="100" w:type="dxa"/>
+            </w:tcMar>
+          </w:tcPr>
+          <w:p>
+            <w:r>
+              <w:rPr>
+                <w:rFonts w:ascii="Segoe UI" w:hAnsi="Segoe UI"/>
+                <w:b/>
+                <w:color w:val="FFFFFF"/>
+                <w:sz w:val="19"/>
+              </w:rPr>
+              <w:t>Concepto clave</w:t>
+            </w:r>
+          </w:p>
+        </w:tc>
+        <w:tc>
+          <w:tcPr>
+            <w:tcW w:type="dxa" w:w="3312"/>
+            <w:shd w:fill="104B8E"/>
+            <w:tcMar>
+              <w:top w:w="80" w:type="dxa"/>
+              <w:bottom w:w="80" w:type="dxa"/>
+              <w:left w:w="100" w:type="dxa"/>
+              <w:right w:w="100" w:type="dxa"/>
+            </w:tcMar>
+          </w:tcPr>
+          <w:p>
+            <w:r>
+              <w:rPr>
+                <w:rFonts w:ascii="Segoe UI" w:hAnsi="Segoe UI"/>
+                <w:b/>
+                <w:color w:val="FFFFFF"/>
+                <w:sz w:val="19"/>
+              </w:rPr>
+              <w:t>Función en HuertoHogar</w:t>
+            </w:r>
+          </w:p>
+        </w:tc>
+      </w:tr>
+      <w:tr>
+        <w:tc>
+          <w:tcPr>
+            <w:tcW w:type="dxa" w:w="2592"/>
+            <w:shd w:fill="F8F9FA"/>
+            <w:tcMar>
+              <w:top w:w="70" w:type="dxa"/>
+              <w:bottom w:w="70" w:type="dxa"/>
+              <w:left w:w="90" w:type="dxa"/>
+              <w:right w:w="90" w:type="dxa"/>
+            </w:tcMar>
+          </w:tcPr>
+          <w:p>
             <w:r>
               <w:rPr>
                 <w:rFonts w:ascii="Segoe UI" w:hAnsi="Segoe UI"/>
                 <w:color w:val="212529"/>
-                <w:sz w:val="20"/>
+                <w:sz w:val="18"/>
               </w:rPr>
-              <w:t>En AWS Academy (Learner Lab), cuando presionas 'End Lab' o 'Stop Lab', la máquina se apaga. Al volver a iniciarla, AWS le asignará una nueva IP pública. El proyecto sigue intacto; solo debes copiar la nueva IP y ponerle :3000.</w:t>
+              <w:t>CartContext</w:t>
+            </w:r>
+          </w:p>
+        </w:tc>
+        <w:tc>
+          <w:tcPr>
+            <w:tcW w:type="dxa" w:w="2304"/>
+            <w:shd w:fill="F8F9FA"/>
+            <w:tcMar>
+              <w:top w:w="70" w:type="dxa"/>
+              <w:bottom w:w="70" w:type="dxa"/>
+              <w:left w:w="90" w:type="dxa"/>
+              <w:right w:w="90" w:type="dxa"/>
+            </w:tcMar>
+          </w:tcPr>
+          <w:p>
+            <w:r>
+              <w:rPr>
+                <w:rFonts w:ascii="Segoe UI" w:hAnsi="Segoe UI"/>
+                <w:color w:val="212529"/>
+                <w:sz w:val="18"/>
+              </w:rPr>
+              <w:t>Lógica y Memoria</w:t>
+            </w:r>
+          </w:p>
+        </w:tc>
+        <w:tc>
+          <w:tcPr>
+            <w:tcW w:type="dxa" w:w="4896"/>
+            <w:shd w:fill="F8F9FA"/>
+            <w:tcMar>
+              <w:top w:w="70" w:type="dxa"/>
+              <w:bottom w:w="70" w:type="dxa"/>
+              <w:left w:w="90" w:type="dxa"/>
+              <w:right w:w="90" w:type="dxa"/>
+            </w:tcMar>
+          </w:tcPr>
+          <w:p>
+            <w:r>
+              <w:rPr>
+                <w:rFonts w:ascii="Segoe UI" w:hAnsi="Segoe UI"/>
+                <w:color w:val="212529"/>
+                <w:sz w:val="18"/>
+              </w:rPr>
+              <w:t>Cerebro central del carrito: guarda los productos seleccionados, calcula el precio total a pagar y provee funciones para agregar, restar o vaciar.</w:t>
+            </w:r>
+          </w:p>
+        </w:tc>
+      </w:tr>
+      <w:tr>
+        <w:tc>
+          <w:tcPr>
+            <w:tcW w:type="dxa" w:w="2592"/>
+            <w:shd w:fill="FFFFFF"/>
+            <w:tcMar>
+              <w:top w:w="70" w:type="dxa"/>
+              <w:bottom w:w="70" w:type="dxa"/>
+              <w:left w:w="90" w:type="dxa"/>
+              <w:right w:w="90" w:type="dxa"/>
+            </w:tcMar>
+          </w:tcPr>
+          <w:p>
+            <w:r>
+              <w:rPr>
+                <w:rFonts w:ascii="Segoe UI" w:hAnsi="Segoe UI"/>
+                <w:color w:val="212529"/>
+                <w:sz w:val="18"/>
+              </w:rPr>
+              <w:t>data (db.js)</w:t>
+            </w:r>
+          </w:p>
+        </w:tc>
+        <w:tc>
+          <w:tcPr>
+            <w:tcW w:type="dxa" w:w="2304"/>
+            <w:shd w:fill="FFFFFF"/>
+            <w:tcMar>
+              <w:top w:w="70" w:type="dxa"/>
+              <w:bottom w:w="70" w:type="dxa"/>
+              <w:left w:w="90" w:type="dxa"/>
+              <w:right w:w="90" w:type="dxa"/>
+            </w:tcMar>
+          </w:tcPr>
+          <w:p>
+            <w:r>
+              <w:rPr>
+                <w:rFonts w:ascii="Segoe UI" w:hAnsi="Segoe UI"/>
+                <w:color w:val="212529"/>
+                <w:sz w:val="18"/>
+              </w:rPr>
+              <w:t>Nuestros Objetos</w:t>
+            </w:r>
+          </w:p>
+        </w:tc>
+        <w:tc>
+          <w:tcPr>
+            <w:tcW w:type="dxa" w:w="4896"/>
+            <w:shd w:fill="FFFFFF"/>
+            <w:tcMar>
+              <w:top w:w="70" w:type="dxa"/>
+              <w:bottom w:w="70" w:type="dxa"/>
+              <w:left w:w="90" w:type="dxa"/>
+              <w:right w:w="90" w:type="dxa"/>
+            </w:tcMar>
+          </w:tcPr>
+          <w:p>
+            <w:r>
+              <w:rPr>
+                <w:rFonts w:ascii="Segoe UI" w:hAnsi="Segoe UI"/>
+                <w:color w:val="212529"/>
+                <w:sz w:val="18"/>
+              </w:rPr>
+              <w:t>Base de datos simulada con los objetos del catálogo: manzanas, naranjas, leche, etc., con su id, precio, stock y categoría.</w:t>
+            </w:r>
+          </w:p>
+        </w:tc>
+      </w:tr>
+      <w:tr>
+        <w:tc>
+          <w:tcPr>
+            <w:tcW w:type="dxa" w:w="2592"/>
+            <w:shd w:fill="F8F9FA"/>
+            <w:tcMar>
+              <w:top w:w="70" w:type="dxa"/>
+              <w:bottom w:w="70" w:type="dxa"/>
+              <w:left w:w="90" w:type="dxa"/>
+              <w:right w:w="90" w:type="dxa"/>
+            </w:tcMar>
+          </w:tcPr>
+          <w:p>
+            <w:r>
+              <w:rPr>
+                <w:rFonts w:ascii="Segoe UI" w:hAnsi="Segoe UI"/>
+                <w:color w:val="212529"/>
+                <w:sz w:val="18"/>
+              </w:rPr>
+              <w:t>pages</w:t>
+            </w:r>
+          </w:p>
+        </w:tc>
+        <w:tc>
+          <w:tcPr>
+            <w:tcW w:type="dxa" w:w="2304"/>
+            <w:shd w:fill="F8F9FA"/>
+            <w:tcMar>
+              <w:top w:w="70" w:type="dxa"/>
+              <w:bottom w:w="70" w:type="dxa"/>
+              <w:left w:w="90" w:type="dxa"/>
+              <w:right w:w="90" w:type="dxa"/>
+            </w:tcMar>
+          </w:tcPr>
+          <w:p>
+            <w:r>
+              <w:rPr>
+                <w:rFonts w:ascii="Segoe UI" w:hAnsi="Segoe UI"/>
+                <w:color w:val="212529"/>
+                <w:sz w:val="18"/>
+              </w:rPr>
+              <w:t>Ventanas / Pantallas</w:t>
+            </w:r>
+          </w:p>
+        </w:tc>
+        <w:tc>
+          <w:tcPr>
+            <w:tcW w:type="dxa" w:w="4896"/>
+            <w:shd w:fill="F8F9FA"/>
+            <w:tcMar>
+              <w:top w:w="70" w:type="dxa"/>
+              <w:bottom w:w="70" w:type="dxa"/>
+              <w:left w:w="90" w:type="dxa"/>
+              <w:right w:w="90" w:type="dxa"/>
+            </w:tcMar>
+          </w:tcPr>
+          <w:p>
+            <w:r>
+              <w:rPr>
+                <w:rFonts w:ascii="Segoe UI" w:hAnsi="Segoe UI"/>
+                <w:color w:val="212529"/>
+                <w:sz w:val="18"/>
+              </w:rPr>
+              <w:t>Vistas completas de la tienda: Inicio (Home), Carrito (Cart), Pagar (Checkout), Administrador (AdminProducts), Login y Registro.</w:t>
+            </w:r>
+          </w:p>
+        </w:tc>
+      </w:tr>
+      <w:tr>
+        <w:tc>
+          <w:tcPr>
+            <w:tcW w:type="dxa" w:w="2592"/>
+            <w:shd w:fill="FFFFFF"/>
+            <w:tcMar>
+              <w:top w:w="70" w:type="dxa"/>
+              <w:bottom w:w="70" w:type="dxa"/>
+              <w:left w:w="90" w:type="dxa"/>
+              <w:right w:w="90" w:type="dxa"/>
+            </w:tcMar>
+          </w:tcPr>
+          <w:p>
+            <w:r>
+              <w:rPr>
+                <w:rFonts w:ascii="Segoe UI" w:hAnsi="Segoe UI"/>
+                <w:color w:val="212529"/>
+                <w:sz w:val="18"/>
+              </w:rPr>
+              <w:t>components</w:t>
+            </w:r>
+          </w:p>
+        </w:tc>
+        <w:tc>
+          <w:tcPr>
+            <w:tcW w:type="dxa" w:w="2304"/>
+            <w:shd w:fill="FFFFFF"/>
+            <w:tcMar>
+              <w:top w:w="70" w:type="dxa"/>
+              <w:bottom w:w="70" w:type="dxa"/>
+              <w:left w:w="90" w:type="dxa"/>
+              <w:right w:w="90" w:type="dxa"/>
+            </w:tcMar>
+          </w:tcPr>
+          <w:p>
+            <w:r>
+              <w:rPr>
+                <w:rFonts w:ascii="Segoe UI" w:hAnsi="Segoe UI"/>
+                <w:color w:val="212529"/>
+                <w:sz w:val="18"/>
+              </w:rPr>
+              <w:t>Piezas Reutilizables</w:t>
+            </w:r>
+          </w:p>
+        </w:tc>
+        <w:tc>
+          <w:tcPr>
+            <w:tcW w:type="dxa" w:w="4896"/>
+            <w:shd w:fill="FFFFFF"/>
+            <w:tcMar>
+              <w:top w:w="70" w:type="dxa"/>
+              <w:bottom w:w="70" w:type="dxa"/>
+              <w:left w:w="90" w:type="dxa"/>
+              <w:right w:w="90" w:type="dxa"/>
+            </w:tcMar>
+          </w:tcPr>
+          <w:p>
+            <w:r>
+              <w:rPr>
+                <w:rFonts w:ascii="Segoe UI" w:hAnsi="Segoe UI"/>
+                <w:color w:val="212529"/>
+                <w:sz w:val="18"/>
+              </w:rPr>
+              <w:t>Bloques que arman la página: Navbar (encabezado/menú), Footer (pie de página) y ProductCard (tarjeta de cada producto).</w:t>
+            </w:r>
+          </w:p>
+        </w:tc>
+      </w:tr>
+      <w:tr>
+        <w:tc>
+          <w:tcPr>
+            <w:tcW w:type="dxa" w:w="2592"/>
+            <w:shd w:fill="F8F9FA"/>
+            <w:tcMar>
+              <w:top w:w="70" w:type="dxa"/>
+              <w:bottom w:w="70" w:type="dxa"/>
+              <w:left w:w="90" w:type="dxa"/>
+              <w:right w:w="90" w:type="dxa"/>
+            </w:tcMar>
+          </w:tcPr>
+          <w:p>
+            <w:r>
+              <w:rPr>
+                <w:rFonts w:ascii="Segoe UI" w:hAnsi="Segoe UI"/>
+                <w:color w:val="212529"/>
+                <w:sz w:val="18"/>
+              </w:rPr>
+              <w:t>assets (public/assets)</w:t>
+            </w:r>
+          </w:p>
+        </w:tc>
+        <w:tc>
+          <w:tcPr>
+            <w:tcW w:type="dxa" w:w="2304"/>
+            <w:shd w:fill="F8F9FA"/>
+            <w:tcMar>
+              <w:top w:w="70" w:type="dxa"/>
+              <w:bottom w:w="70" w:type="dxa"/>
+              <w:left w:w="90" w:type="dxa"/>
+              <w:right w:w="90" w:type="dxa"/>
+            </w:tcMar>
+          </w:tcPr>
+          <w:p>
+            <w:r>
+              <w:rPr>
+                <w:rFonts w:ascii="Segoe UI" w:hAnsi="Segoe UI"/>
+                <w:color w:val="212529"/>
+                <w:sz w:val="18"/>
+              </w:rPr>
+              <w:t>Imágenes</w:t>
+            </w:r>
+          </w:p>
+        </w:tc>
+        <w:tc>
+          <w:tcPr>
+            <w:tcW w:type="dxa" w:w="4896"/>
+            <w:shd w:fill="F8F9FA"/>
+            <w:tcMar>
+              <w:top w:w="70" w:type="dxa"/>
+              <w:bottom w:w="70" w:type="dxa"/>
+              <w:left w:w="90" w:type="dxa"/>
+              <w:right w:w="90" w:type="dxa"/>
+            </w:tcMar>
+          </w:tcPr>
+          <w:p>
+            <w:r>
+              <w:rPr>
+                <w:rFonts w:ascii="Segoe UI" w:hAnsi="Segoe UI"/>
+                <w:color w:val="212529"/>
+                <w:sz w:val="18"/>
+              </w:rPr>
+              <w:t>Carpeta pública donde se alojan las fotos de los productos (manzanas.jpg, platanos.png, logo.png) para que carguen directo en la web.</w:t>
+            </w:r>
+          </w:p>
+        </w:tc>
+      </w:tr>
+      <w:tr>
+        <w:tc>
+          <w:tcPr>
+            <w:tcW w:type="dxa" w:w="2592"/>
+            <w:shd w:fill="FFFFFF"/>
+            <w:tcMar>
+              <w:top w:w="70" w:type="dxa"/>
+              <w:bottom w:w="70" w:type="dxa"/>
+              <w:left w:w="90" w:type="dxa"/>
+              <w:right w:w="90" w:type="dxa"/>
+            </w:tcMar>
+          </w:tcPr>
+          <w:p>
+            <w:r>
+              <w:rPr>
+                <w:rFonts w:ascii="Segoe UI" w:hAnsi="Segoe UI"/>
+                <w:color w:val="212529"/>
+                <w:sz w:val="18"/>
+              </w:rPr>
+              <w:t>__tests__ (test)</w:t>
+            </w:r>
+          </w:p>
+        </w:tc>
+        <w:tc>
+          <w:tcPr>
+            <w:tcW w:type="dxa" w:w="2304"/>
+            <w:shd w:fill="FFFFFF"/>
+            <w:tcMar>
+              <w:top w:w="70" w:type="dxa"/>
+              <w:bottom w:w="70" w:type="dxa"/>
+              <w:left w:w="90" w:type="dxa"/>
+              <w:right w:w="90" w:type="dxa"/>
+            </w:tcMar>
+          </w:tcPr>
+          <w:p>
+            <w:r>
+              <w:rPr>
+                <w:rFonts w:ascii="Segoe UI" w:hAnsi="Segoe UI"/>
+                <w:color w:val="212529"/>
+                <w:sz w:val="18"/>
+              </w:rPr>
+              <w:t>Pruebas Unitarias</w:t>
+            </w:r>
+          </w:p>
+        </w:tc>
+        <w:tc>
+          <w:tcPr>
+            <w:tcW w:type="dxa" w:w="4896"/>
+            <w:shd w:fill="FFFFFF"/>
+            <w:tcMar>
+              <w:top w:w="70" w:type="dxa"/>
+              <w:bottom w:w="70" w:type="dxa"/>
+              <w:left w:w="90" w:type="dxa"/>
+              <w:right w:w="90" w:type="dxa"/>
+            </w:tcMar>
+          </w:tcPr>
+          <w:p>
+            <w:r>
+              <w:rPr>
+                <w:rFonts w:ascii="Segoe UI" w:hAnsi="Segoe UI"/>
+                <w:color w:val="212529"/>
+                <w:sz w:val="18"/>
+              </w:rPr>
+              <w:t>Pruebas automáticas que validan que el carrito sume bien y que el CRUD funcione correctamente sin errores.</w:t>
+            </w:r>
+          </w:p>
+        </w:tc>
+      </w:tr>
+      <w:tr>
+        <w:tc>
+          <w:tcPr>
+            <w:tcW w:type="dxa" w:w="2592"/>
+            <w:shd w:fill="F8F9FA"/>
+            <w:tcMar>
+              <w:top w:w="70" w:type="dxa"/>
+              <w:bottom w:w="70" w:type="dxa"/>
+              <w:left w:w="90" w:type="dxa"/>
+              <w:right w:w="90" w:type="dxa"/>
+            </w:tcMar>
+          </w:tcPr>
+          <w:p>
+            <w:r>
+              <w:rPr>
+                <w:rFonts w:ascii="Segoe UI" w:hAnsi="Segoe UI"/>
+                <w:color w:val="212529"/>
+                <w:sz w:val="18"/>
+              </w:rPr>
+              <w:t>main.jsx</w:t>
+            </w:r>
+          </w:p>
+        </w:tc>
+        <w:tc>
+          <w:tcPr>
+            <w:tcW w:type="dxa" w:w="2304"/>
+            <w:shd w:fill="F8F9FA"/>
+            <w:tcMar>
+              <w:top w:w="70" w:type="dxa"/>
+              <w:bottom w:w="70" w:type="dxa"/>
+              <w:left w:w="90" w:type="dxa"/>
+              <w:right w:w="90" w:type="dxa"/>
+            </w:tcMar>
+          </w:tcPr>
+          <w:p>
+            <w:r>
+              <w:rPr>
+                <w:rFonts w:ascii="Segoe UI" w:hAnsi="Segoe UI"/>
+                <w:color w:val="212529"/>
+                <w:sz w:val="18"/>
+              </w:rPr>
+              <w:t>Punto de Partida</w:t>
+            </w:r>
+          </w:p>
+        </w:tc>
+        <w:tc>
+          <w:tcPr>
+            <w:tcW w:type="dxa" w:w="4896"/>
+            <w:shd w:fill="F8F9FA"/>
+            <w:tcMar>
+              <w:top w:w="70" w:type="dxa"/>
+              <w:bottom w:w="70" w:type="dxa"/>
+              <w:left w:w="90" w:type="dxa"/>
+              <w:right w:w="90" w:type="dxa"/>
+            </w:tcMar>
+          </w:tcPr>
+          <w:p>
+            <w:r>
+              <w:rPr>
+                <w:rFonts w:ascii="Segoe UI" w:hAnsi="Segoe UI"/>
+                <w:color w:val="212529"/>
+                <w:sz w:val="18"/>
+              </w:rPr>
+              <w:t>Primer archivo que se ejecuta al abrir la web; inyecta React en el HTML principal.</w:t>
+            </w:r>
+          </w:p>
+        </w:tc>
+      </w:tr>
+      <w:tr>
+        <w:tc>
+          <w:tcPr>
+            <w:tcW w:type="dxa" w:w="2592"/>
+            <w:shd w:fill="FFFFFF"/>
+            <w:tcMar>
+              <w:top w:w="70" w:type="dxa"/>
+              <w:bottom w:w="70" w:type="dxa"/>
+              <w:left w:w="90" w:type="dxa"/>
+              <w:right w:w="90" w:type="dxa"/>
+            </w:tcMar>
+          </w:tcPr>
+          <w:p>
+            <w:r>
+              <w:rPr>
+                <w:rFonts w:ascii="Segoe UI" w:hAnsi="Segoe UI"/>
+                <w:color w:val="212529"/>
+                <w:sz w:val="18"/>
+              </w:rPr>
+              <w:t>App.jsx</w:t>
+            </w:r>
+          </w:p>
+        </w:tc>
+        <w:tc>
+          <w:tcPr>
+            <w:tcW w:type="dxa" w:w="2304"/>
+            <w:shd w:fill="FFFFFF"/>
+            <w:tcMar>
+              <w:top w:w="70" w:type="dxa"/>
+              <w:bottom w:w="70" w:type="dxa"/>
+              <w:left w:w="90" w:type="dxa"/>
+              <w:right w:w="90" w:type="dxa"/>
+            </w:tcMar>
+          </w:tcPr>
+          <w:p>
+            <w:r>
+              <w:rPr>
+                <w:rFonts w:ascii="Segoe UI" w:hAnsi="Segoe UI"/>
+                <w:color w:val="212529"/>
+                <w:sz w:val="18"/>
+              </w:rPr>
+              <w:t>Organizador Maestro</w:t>
+            </w:r>
+          </w:p>
+        </w:tc>
+        <w:tc>
+          <w:tcPr>
+            <w:tcW w:type="dxa" w:w="4896"/>
+            <w:shd w:fill="FFFFFF"/>
+            <w:tcMar>
+              <w:top w:w="70" w:type="dxa"/>
+              <w:bottom w:w="70" w:type="dxa"/>
+              <w:left w:w="90" w:type="dxa"/>
+              <w:right w:w="90" w:type="dxa"/>
+            </w:tcMar>
+          </w:tcPr>
+          <w:p>
+            <w:r>
+              <w:rPr>
+                <w:rFonts w:ascii="Segoe UI" w:hAnsi="Segoe UI"/>
+                <w:color w:val="212529"/>
+                <w:sz w:val="18"/>
+              </w:rPr>
+              <w:t>Conecta las rutas del menú, coloca el Navbar arriba, el Footer abajo y muestra la página correspondiente.</w:t>
+            </w:r>
+          </w:p>
+        </w:tc>
+      </w:tr>
+      <w:tr>
+        <w:tc>
+          <w:tcPr>
+            <w:tcW w:type="dxa" w:w="2592"/>
+            <w:shd w:fill="F8F9FA"/>
+            <w:tcMar>
+              <w:top w:w="70" w:type="dxa"/>
+              <w:bottom w:w="70" w:type="dxa"/>
+              <w:left w:w="90" w:type="dxa"/>
+              <w:right w:w="90" w:type="dxa"/>
+            </w:tcMar>
+          </w:tcPr>
+          <w:p>
+            <w:r>
+              <w:rPr>
+                <w:rFonts w:ascii="Segoe UI" w:hAnsi="Segoe UI"/>
+                <w:color w:val="212529"/>
+                <w:sz w:val="18"/>
+              </w:rPr>
+              <w:t>index.css / App.css</w:t>
+            </w:r>
+          </w:p>
+        </w:tc>
+        <w:tc>
+          <w:tcPr>
+            <w:tcW w:type="dxa" w:w="2304"/>
+            <w:shd w:fill="F8F9FA"/>
+            <w:tcMar>
+              <w:top w:w="70" w:type="dxa"/>
+              <w:bottom w:w="70" w:type="dxa"/>
+              <w:left w:w="90" w:type="dxa"/>
+              <w:right w:w="90" w:type="dxa"/>
+            </w:tcMar>
+          </w:tcPr>
+          <w:p>
+            <w:r>
+              <w:rPr>
+                <w:rFonts w:ascii="Segoe UI" w:hAnsi="Segoe UI"/>
+                <w:color w:val="212529"/>
+                <w:sz w:val="18"/>
+              </w:rPr>
+              <w:t>Estilos Visuales</w:t>
+            </w:r>
+          </w:p>
+        </w:tc>
+        <w:tc>
+          <w:tcPr>
+            <w:tcW w:type="dxa" w:w="4896"/>
+            <w:shd w:fill="F8F9FA"/>
+            <w:tcMar>
+              <w:top w:w="70" w:type="dxa"/>
+              <w:bottom w:w="70" w:type="dxa"/>
+              <w:left w:w="90" w:type="dxa"/>
+              <w:right w:w="90" w:type="dxa"/>
+            </w:tcMar>
+          </w:tcPr>
+          <w:p>
+            <w:r>
+              <w:rPr>
+                <w:rFonts w:ascii="Segoe UI" w:hAnsi="Segoe UI"/>
+                <w:color w:val="212529"/>
+                <w:sz w:val="18"/>
+              </w:rPr>
+              <w:t>index.css define fuentes y colores globales; App.css aplica los estilos de tarjetas y botones.</w:t>
             </w:r>
           </w:p>
         </w:tc>
@@ -180,132 +772,29 @@
     <w:p>
       <w:pPr>
         <w:keepNext/>
-        <w:spacing w:before="320" w:after="120"/>
+        <w:spacing w:before="280" w:after="120"/>
       </w:pPr>
       <w:r>
         <w:rPr>
           <w:rFonts w:ascii="Segoe UI" w:hAnsi="Segoe UI"/>
           <w:b/>
           <w:color w:val="104B8E"/>
-          <w:sz w:val="30"/>
+          <w:sz w:val="28"/>
         </w:rPr>
-        <w:t>2. ¿Dónde encontrar tu número de IP pública en AWS?</w:t>
+        <w:t>2. Parámetros exactos para Crear la Instancia en AWS EC2</w:t>
       </w:r>
     </w:p>
     <w:p>
       <w:pPr>
-        <w:spacing w:after="120" w:line="276" w:lineRule="auto"/>
-      </w:pPr>
-      <w:r>
-        <w:rPr>
-          <w:rFonts w:ascii="Segoe UI" w:hAnsi="Segoe UI"/>
-          <w:b/>
-          <w:color w:val="212529"/>
-          <w:sz w:val="21"/>
-        </w:rPr>
-        <w:t xml:space="preserve">Ubicación: </w:t>
-      </w:r>
-      <w:r>
-        <w:rPr>
-          <w:rFonts w:ascii="Segoe UI" w:hAnsi="Segoe UI"/>
-          <w:color w:val="212529"/>
-          <w:sz w:val="21"/>
-        </w:rPr>
-        <w:t>Tienes 3 formas muy sencillas de ver tu IP:</w:t>
-      </w:r>
-    </w:p>
-    <w:p>
-      <w:pPr>
-        <w:spacing w:after="120" w:line="276" w:lineRule="auto"/>
-      </w:pPr>
-      <w:r>
-        <w:rPr>
-          <w:rFonts w:ascii="Segoe UI" w:hAnsi="Segoe UI"/>
-          <w:b/>
-          <w:color w:val="212529"/>
-          <w:sz w:val="21"/>
-        </w:rPr>
-        <w:t xml:space="preserve">1. En la propia terminal web: </w:t>
-      </w:r>
-      <w:r>
-        <w:rPr>
-          <w:rFonts w:ascii="Segoe UI" w:hAnsi="Segoe UI"/>
-          <w:color w:val="212529"/>
-          <w:sz w:val="21"/>
-        </w:rPr>
-        <w:t>En la barra inferior gris de la pantalla negra de comandos verás: 'IP públicas: 34.230.35.62'.</w:t>
-      </w:r>
-    </w:p>
-    <w:p>
-      <w:pPr>
-        <w:spacing w:after="120" w:line="276" w:lineRule="auto"/>
-      </w:pPr>
-      <w:r>
-        <w:rPr>
-          <w:rFonts w:ascii="Segoe UI" w:hAnsi="Segoe UI"/>
-          <w:b/>
-          <w:color w:val="212529"/>
-          <w:sz w:val="21"/>
-        </w:rPr>
-        <w:t xml:space="preserve">2. En la consola de AWS EC2: </w:t>
-      </w:r>
-      <w:r>
-        <w:rPr>
-          <w:rFonts w:ascii="Segoe UI" w:hAnsi="Segoe UI"/>
-          <w:color w:val="212529"/>
-          <w:sz w:val="21"/>
-        </w:rPr>
-        <w:t>Ve a EC2 &gt; Instancias &gt; Haz clic en tu instancia 'reactBootstrap'. En el panel 'Resumen' verás el campo 'Dirección IPv4 pública' con un botón de copiar.</w:t>
-      </w:r>
-    </w:p>
-    <w:p>
-      <w:pPr>
-        <w:spacing w:after="120" w:line="276" w:lineRule="auto"/>
-      </w:pPr>
-      <w:r>
-        <w:rPr>
-          <w:rFonts w:ascii="Segoe UI" w:hAnsi="Segoe UI"/>
-          <w:b/>
-          <w:color w:val="212529"/>
-          <w:sz w:val="21"/>
-        </w:rPr>
-        <w:t xml:space="preserve">3. Mediante comando: </w:t>
-      </w:r>
-      <w:r>
-        <w:rPr>
-          <w:rFonts w:ascii="Segoe UI" w:hAnsi="Segoe UI"/>
-          <w:color w:val="212529"/>
-          <w:sz w:val="21"/>
-        </w:rPr>
-        <w:t>Dentro de la terminal de comandos de Ubuntu, escribe: curl ifconfig.me y presiona Enter.</w:t>
-      </w:r>
-    </w:p>
-    <w:p>
-      <w:pPr>
-        <w:keepNext/>
-        <w:spacing w:before="320" w:after="120"/>
-      </w:pPr>
-      <w:r>
-        <w:rPr>
-          <w:rFonts w:ascii="Segoe UI" w:hAnsi="Segoe UI"/>
-          <w:b/>
-          <w:color w:val="104B8E"/>
-          <w:sz w:val="30"/>
-        </w:rPr>
-        <w:t>3. Parámetros exactos para Crear la Instancia EC2</w:t>
-      </w:r>
-    </w:p>
-    <w:p>
-      <w:pPr>
-        <w:spacing w:after="120" w:line="276" w:lineRule="auto"/>
+        <w:spacing w:after="100" w:line="276" w:lineRule="auto"/>
       </w:pPr>
       <w:r>
         <w:rPr>
           <w:rFonts w:ascii="Segoe UI" w:hAnsi="Segoe UI"/>
           <w:color w:val="212529"/>
-          <w:sz w:val="21"/>
+          <w:sz w:val="20"/>
         </w:rPr>
-        <w:t>Al presionar el botón naranja 'Lanzar instancias' en la consola de AWS EC2, rellena únicamente estos campos:</w:t>
+        <w:t>Al entrar a la consola de AWS EC2 y presionar el botón naranja 'Lanzar instancias', completa únicamente estos datos:</w:t>
       </w:r>
     </w:p>
     <w:tbl>
@@ -326,10 +815,10 @@
             <w:tcW w:type="dxa" w:w="3312"/>
             <w:shd w:fill="104B8E"/>
             <w:tcMar>
-              <w:top w:w="100" w:type="dxa"/>
-              <w:bottom w:w="100" w:type="dxa"/>
-              <w:left w:w="120" w:type="dxa"/>
-              <w:right w:w="120" w:type="dxa"/>
+              <w:top w:w="80" w:type="dxa"/>
+              <w:bottom w:w="80" w:type="dxa"/>
+              <w:left w:w="100" w:type="dxa"/>
+              <w:right w:w="100" w:type="dxa"/>
             </w:tcMar>
           </w:tcPr>
           <w:p>
@@ -338,7 +827,7 @@
                 <w:rFonts w:ascii="Segoe UI" w:hAnsi="Segoe UI"/>
                 <w:b/>
                 <w:color w:val="FFFFFF"/>
-                <w:sz w:val="20"/>
+                <w:sz w:val="19"/>
               </w:rPr>
               <w:t>Sección en AWS</w:t>
             </w:r>
@@ -349,10 +838,10 @@
             <w:tcW w:type="dxa" w:w="3312"/>
             <w:shd w:fill="104B8E"/>
             <w:tcMar>
-              <w:top w:w="100" w:type="dxa"/>
-              <w:bottom w:w="100" w:type="dxa"/>
-              <w:left w:w="120" w:type="dxa"/>
-              <w:right w:w="120" w:type="dxa"/>
+              <w:top w:w="80" w:type="dxa"/>
+              <w:bottom w:w="80" w:type="dxa"/>
+              <w:left w:w="100" w:type="dxa"/>
+              <w:right w:w="100" w:type="dxa"/>
             </w:tcMar>
           </w:tcPr>
           <w:p>
@@ -361,7 +850,7 @@
                 <w:rFonts w:ascii="Segoe UI" w:hAnsi="Segoe UI"/>
                 <w:b/>
                 <w:color w:val="FFFFFF"/>
-                <w:sz w:val="20"/>
+                <w:sz w:val="19"/>
               </w:rPr>
               <w:t>Campo</w:t>
             </w:r>
@@ -372,10 +861,10 @@
             <w:tcW w:type="dxa" w:w="3312"/>
             <w:shd w:fill="104B8E"/>
             <w:tcMar>
-              <w:top w:w="100" w:type="dxa"/>
-              <w:bottom w:w="100" w:type="dxa"/>
-              <w:left w:w="120" w:type="dxa"/>
-              <w:right w:w="120" w:type="dxa"/>
+              <w:top w:w="80" w:type="dxa"/>
+              <w:bottom w:w="80" w:type="dxa"/>
+              <w:left w:w="100" w:type="dxa"/>
+              <w:right w:w="100" w:type="dxa"/>
             </w:tcMar>
           </w:tcPr>
           <w:p>
@@ -384,7 +873,7 @@
                 <w:rFonts w:ascii="Segoe UI" w:hAnsi="Segoe UI"/>
                 <w:b/>
                 <w:color w:val="FFFFFF"/>
-                <w:sz w:val="20"/>
+                <w:sz w:val="19"/>
               </w:rPr>
               <w:t>Valor a colocar</w:t>
             </w:r>
@@ -397,10 +886,10 @@
             <w:tcW w:type="dxa" w:w="2880"/>
             <w:shd w:fill="F8F9FA"/>
             <w:tcMar>
-              <w:top w:w="80" w:type="dxa"/>
-              <w:bottom w:w="80" w:type="dxa"/>
-              <w:left w:w="100" w:type="dxa"/>
-              <w:right w:w="100" w:type="dxa"/>
+              <w:top w:w="70" w:type="dxa"/>
+              <w:bottom w:w="70" w:type="dxa"/>
+              <w:left w:w="90" w:type="dxa"/>
+              <w:right w:w="90" w:type="dxa"/>
             </w:tcMar>
           </w:tcPr>
           <w:p>
@@ -408,7 +897,7 @@
               <w:rPr>
                 <w:rFonts w:ascii="Segoe UI" w:hAnsi="Segoe UI"/>
                 <w:color w:val="212529"/>
-                <w:sz w:val="19"/>
+                <w:sz w:val="18"/>
               </w:rPr>
               <w:t>Nombre y etiquetas</w:t>
             </w:r>
@@ -419,10 +908,10 @@
             <w:tcW w:type="dxa" w:w="2592"/>
             <w:shd w:fill="F8F9FA"/>
             <w:tcMar>
-              <w:top w:w="80" w:type="dxa"/>
-              <w:bottom w:w="80" w:type="dxa"/>
-              <w:left w:w="100" w:type="dxa"/>
-              <w:right w:w="100" w:type="dxa"/>
+              <w:top w:w="70" w:type="dxa"/>
+              <w:bottom w:w="70" w:type="dxa"/>
+              <w:left w:w="90" w:type="dxa"/>
+              <w:right w:w="90" w:type="dxa"/>
             </w:tcMar>
           </w:tcPr>
           <w:p>
@@ -430,7 +919,7 @@
               <w:rPr>
                 <w:rFonts w:ascii="Segoe UI" w:hAnsi="Segoe UI"/>
                 <w:color w:val="212529"/>
-                <w:sz w:val="19"/>
+                <w:sz w:val="18"/>
               </w:rPr>
               <w:t>Nombre</w:t>
             </w:r>
@@ -441,10 +930,10 @@
             <w:tcW w:type="dxa" w:w="4320"/>
             <w:shd w:fill="F8F9FA"/>
             <w:tcMar>
-              <w:top w:w="80" w:type="dxa"/>
-              <w:bottom w:w="80" w:type="dxa"/>
-              <w:left w:w="100" w:type="dxa"/>
-              <w:right w:w="100" w:type="dxa"/>
+              <w:top w:w="70" w:type="dxa"/>
+              <w:bottom w:w="70" w:type="dxa"/>
+              <w:left w:w="90" w:type="dxa"/>
+              <w:right w:w="90" w:type="dxa"/>
             </w:tcMar>
           </w:tcPr>
           <w:p>
@@ -452,7 +941,7 @@
               <w:rPr>
                 <w:rFonts w:ascii="Segoe UI" w:hAnsi="Segoe UI"/>
                 <w:color w:val="212529"/>
-                <w:sz w:val="19"/>
+                <w:sz w:val="18"/>
               </w:rPr>
               <w:t>reactBootstrap</w:t>
             </w:r>
@@ -465,10 +954,10 @@
             <w:tcW w:type="dxa" w:w="2880"/>
             <w:shd w:fill="FFFFFF"/>
             <w:tcMar>
-              <w:top w:w="80" w:type="dxa"/>
-              <w:bottom w:w="80" w:type="dxa"/>
-              <w:left w:w="100" w:type="dxa"/>
-              <w:right w:w="100" w:type="dxa"/>
+              <w:top w:w="70" w:type="dxa"/>
+              <w:bottom w:w="70" w:type="dxa"/>
+              <w:left w:w="90" w:type="dxa"/>
+              <w:right w:w="90" w:type="dxa"/>
             </w:tcMar>
           </w:tcPr>
           <w:p>
@@ -476,9 +965,9 @@
               <w:rPr>
                 <w:rFonts w:ascii="Segoe UI" w:hAnsi="Segoe UI"/>
                 <w:color w:val="212529"/>
-                <w:sz w:val="19"/>
+                <w:sz w:val="18"/>
               </w:rPr>
-              <w:t>Imágenes de AMI</w:t>
+              <w:t>Imágenes de software (AMI)</w:t>
             </w:r>
           </w:p>
         </w:tc>
@@ -487,10 +976,10 @@
             <w:tcW w:type="dxa" w:w="2592"/>
             <w:shd w:fill="FFFFFF"/>
             <w:tcMar>
-              <w:top w:w="80" w:type="dxa"/>
-              <w:bottom w:w="80" w:type="dxa"/>
-              <w:left w:w="100" w:type="dxa"/>
-              <w:right w:w="100" w:type="dxa"/>
+              <w:top w:w="70" w:type="dxa"/>
+              <w:bottom w:w="70" w:type="dxa"/>
+              <w:left w:w="90" w:type="dxa"/>
+              <w:right w:w="90" w:type="dxa"/>
             </w:tcMar>
           </w:tcPr>
           <w:p>
@@ -498,7 +987,7 @@
               <w:rPr>
                 <w:rFonts w:ascii="Segoe UI" w:hAnsi="Segoe UI"/>
                 <w:color w:val="212529"/>
-                <w:sz w:val="19"/>
+                <w:sz w:val="18"/>
               </w:rPr>
               <w:t>Sistema Operativo</w:t>
             </w:r>
@@ -509,10 +998,10 @@
             <w:tcW w:type="dxa" w:w="4320"/>
             <w:shd w:fill="FFFFFF"/>
             <w:tcMar>
-              <w:top w:w="80" w:type="dxa"/>
-              <w:bottom w:w="80" w:type="dxa"/>
-              <w:left w:w="100" w:type="dxa"/>
-              <w:right w:w="100" w:type="dxa"/>
+              <w:top w:w="70" w:type="dxa"/>
+              <w:bottom w:w="70" w:type="dxa"/>
+              <w:left w:w="90" w:type="dxa"/>
+              <w:right w:w="90" w:type="dxa"/>
             </w:tcMar>
           </w:tcPr>
           <w:p>
@@ -520,7 +1009,7 @@
               <w:rPr>
                 <w:rFonts w:ascii="Segoe UI" w:hAnsi="Segoe UI"/>
                 <w:color w:val="212529"/>
-                <w:sz w:val="19"/>
+                <w:sz w:val="18"/>
               </w:rPr>
               <w:t>Clic en recuadro naranja 'Ubuntu' (Ubuntu 22.04 o 24.04 LTS)</w:t>
             </w:r>
@@ -533,10 +1022,10 @@
             <w:tcW w:type="dxa" w:w="2880"/>
             <w:shd w:fill="F8F9FA"/>
             <w:tcMar>
-              <w:top w:w="80" w:type="dxa"/>
-              <w:bottom w:w="80" w:type="dxa"/>
-              <w:left w:w="100" w:type="dxa"/>
-              <w:right w:w="100" w:type="dxa"/>
+              <w:top w:w="70" w:type="dxa"/>
+              <w:bottom w:w="70" w:type="dxa"/>
+              <w:left w:w="90" w:type="dxa"/>
+              <w:right w:w="90" w:type="dxa"/>
             </w:tcMar>
           </w:tcPr>
           <w:p>
@@ -544,7 +1033,7 @@
               <w:rPr>
                 <w:rFonts w:ascii="Segoe UI" w:hAnsi="Segoe UI"/>
                 <w:color w:val="212529"/>
-                <w:sz w:val="19"/>
+                <w:sz w:val="18"/>
               </w:rPr>
               <w:t>Tipo de instancia</w:t>
             </w:r>
@@ -555,10 +1044,10 @@
             <w:tcW w:type="dxa" w:w="2592"/>
             <w:shd w:fill="F8F9FA"/>
             <w:tcMar>
-              <w:top w:w="80" w:type="dxa"/>
-              <w:bottom w:w="80" w:type="dxa"/>
-              <w:left w:w="100" w:type="dxa"/>
-              <w:right w:w="100" w:type="dxa"/>
+              <w:top w:w="70" w:type="dxa"/>
+              <w:bottom w:w="70" w:type="dxa"/>
+              <w:left w:w="90" w:type="dxa"/>
+              <w:right w:w="90" w:type="dxa"/>
             </w:tcMar>
           </w:tcPr>
           <w:p>
@@ -566,7 +1055,7 @@
               <w:rPr>
                 <w:rFonts w:ascii="Segoe UI" w:hAnsi="Segoe UI"/>
                 <w:color w:val="212529"/>
-                <w:sz w:val="19"/>
+                <w:sz w:val="18"/>
               </w:rPr>
               <w:t>Tipo de servidor</w:t>
             </w:r>
@@ -577,10 +1066,10 @@
             <w:tcW w:type="dxa" w:w="4320"/>
             <w:shd w:fill="F8F9FA"/>
             <w:tcMar>
-              <w:top w:w="80" w:type="dxa"/>
-              <w:bottom w:w="80" w:type="dxa"/>
-              <w:left w:w="100" w:type="dxa"/>
-              <w:right w:w="100" w:type="dxa"/>
+              <w:top w:w="70" w:type="dxa"/>
+              <w:bottom w:w="70" w:type="dxa"/>
+              <w:left w:w="90" w:type="dxa"/>
+              <w:right w:w="90" w:type="dxa"/>
             </w:tcMar>
           </w:tcPr>
           <w:p>
@@ -588,7 +1077,7 @@
               <w:rPr>
                 <w:rFonts w:ascii="Segoe UI" w:hAnsi="Segoe UI"/>
                 <w:color w:val="212529"/>
-                <w:sz w:val="19"/>
+                <w:sz w:val="18"/>
               </w:rPr>
               <w:t>t2.micro o t3.micro (Apto para capa gratuita)</w:t>
             </w:r>
@@ -601,10 +1090,10 @@
             <w:tcW w:type="dxa" w:w="2880"/>
             <w:shd w:fill="FFFFFF"/>
             <w:tcMar>
-              <w:top w:w="80" w:type="dxa"/>
-              <w:bottom w:w="80" w:type="dxa"/>
-              <w:left w:w="100" w:type="dxa"/>
-              <w:right w:w="100" w:type="dxa"/>
+              <w:top w:w="70" w:type="dxa"/>
+              <w:bottom w:w="70" w:type="dxa"/>
+              <w:left w:w="90" w:type="dxa"/>
+              <w:right w:w="90" w:type="dxa"/>
             </w:tcMar>
           </w:tcPr>
           <w:p>
@@ -612,9 +1101,9 @@
               <w:rPr>
                 <w:rFonts w:ascii="Segoe UI" w:hAnsi="Segoe UI"/>
                 <w:color w:val="212529"/>
-                <w:sz w:val="19"/>
+                <w:sz w:val="18"/>
               </w:rPr>
-              <w:t>Par de claves</w:t>
+              <w:t>Par de claves (Key Pair)</w:t>
             </w:r>
           </w:p>
         </w:tc>
@@ -623,10 +1112,10 @@
             <w:tcW w:type="dxa" w:w="2592"/>
             <w:shd w:fill="FFFFFF"/>
             <w:tcMar>
-              <w:top w:w="80" w:type="dxa"/>
-              <w:bottom w:w="80" w:type="dxa"/>
-              <w:left w:w="100" w:type="dxa"/>
-              <w:right w:w="100" w:type="dxa"/>
+              <w:top w:w="70" w:type="dxa"/>
+              <w:bottom w:w="70" w:type="dxa"/>
+              <w:left w:w="90" w:type="dxa"/>
+              <w:right w:w="90" w:type="dxa"/>
             </w:tcMar>
           </w:tcPr>
           <w:p>
@@ -634,9 +1123,9 @@
               <w:rPr>
                 <w:rFonts w:ascii="Segoe UI" w:hAnsi="Segoe UI"/>
                 <w:color w:val="212529"/>
-                <w:sz w:val="19"/>
+                <w:sz w:val="18"/>
               </w:rPr>
-              <w:t>Key Pair</w:t>
+              <w:t>Clave de acceso</w:t>
             </w:r>
           </w:p>
         </w:tc>
@@ -645,10 +1134,10 @@
             <w:tcW w:type="dxa" w:w="4320"/>
             <w:shd w:fill="FFFFFF"/>
             <w:tcMar>
-              <w:top w:w="80" w:type="dxa"/>
-              <w:bottom w:w="80" w:type="dxa"/>
-              <w:left w:w="100" w:type="dxa"/>
-              <w:right w:w="100" w:type="dxa"/>
+              <w:top w:w="70" w:type="dxa"/>
+              <w:bottom w:w="70" w:type="dxa"/>
+              <w:left w:w="90" w:type="dxa"/>
+              <w:right w:w="90" w:type="dxa"/>
             </w:tcMar>
           </w:tcPr>
           <w:p>
@@ -656,7 +1145,7 @@
               <w:rPr>
                 <w:rFonts w:ascii="Segoe UI" w:hAnsi="Segoe UI"/>
                 <w:color w:val="212529"/>
-                <w:sz w:val="19"/>
+                <w:sz w:val="18"/>
               </w:rPr>
               <w:t>Crear nuevo par -&gt; Nombre: userReact, RSA, .pem</w:t>
             </w:r>
@@ -669,10 +1158,10 @@
             <w:tcW w:type="dxa" w:w="2880"/>
             <w:shd w:fill="F8F9FA"/>
             <w:tcMar>
-              <w:top w:w="80" w:type="dxa"/>
-              <w:bottom w:w="80" w:type="dxa"/>
-              <w:left w:w="100" w:type="dxa"/>
-              <w:right w:w="100" w:type="dxa"/>
+              <w:top w:w="70" w:type="dxa"/>
+              <w:bottom w:w="70" w:type="dxa"/>
+              <w:left w:w="90" w:type="dxa"/>
+              <w:right w:w="90" w:type="dxa"/>
             </w:tcMar>
           </w:tcPr>
           <w:p>
@@ -680,7 +1169,7 @@
               <w:rPr>
                 <w:rFonts w:ascii="Segoe UI" w:hAnsi="Segoe UI"/>
                 <w:color w:val="212529"/>
-                <w:sz w:val="19"/>
+                <w:sz w:val="18"/>
               </w:rPr>
               <w:t>Configuración de red</w:t>
             </w:r>
@@ -691,10 +1180,10 @@
             <w:tcW w:type="dxa" w:w="2592"/>
             <w:shd w:fill="F8F9FA"/>
             <w:tcMar>
-              <w:top w:w="80" w:type="dxa"/>
-              <w:bottom w:w="80" w:type="dxa"/>
-              <w:left w:w="100" w:type="dxa"/>
-              <w:right w:w="100" w:type="dxa"/>
+              <w:top w:w="70" w:type="dxa"/>
+              <w:bottom w:w="70" w:type="dxa"/>
+              <w:left w:w="90" w:type="dxa"/>
+              <w:right w:w="90" w:type="dxa"/>
             </w:tcMar>
           </w:tcPr>
           <w:p>
@@ -702,7 +1191,7 @@
               <w:rPr>
                 <w:rFonts w:ascii="Segoe UI" w:hAnsi="Segoe UI"/>
                 <w:color w:val="212529"/>
-                <w:sz w:val="19"/>
+                <w:sz w:val="18"/>
               </w:rPr>
               <w:t>Casillas rápidas</w:t>
             </w:r>
@@ -713,10 +1202,10 @@
             <w:tcW w:type="dxa" w:w="4320"/>
             <w:shd w:fill="F8F9FA"/>
             <w:tcMar>
-              <w:top w:w="80" w:type="dxa"/>
-              <w:bottom w:w="80" w:type="dxa"/>
-              <w:left w:w="100" w:type="dxa"/>
-              <w:right w:w="100" w:type="dxa"/>
+              <w:top w:w="70" w:type="dxa"/>
+              <w:bottom w:w="70" w:type="dxa"/>
+              <w:left w:w="90" w:type="dxa"/>
+              <w:right w:w="90" w:type="dxa"/>
             </w:tcMar>
           </w:tcPr>
           <w:p>
@@ -724,7 +1213,7 @@
               <w:rPr>
                 <w:rFonts w:ascii="Segoe UI" w:hAnsi="Segoe UI"/>
                 <w:color w:val="212529"/>
-                <w:sz w:val="19"/>
+                <w:sz w:val="18"/>
               </w:rPr>
               <w:t>Marcar casillas: [x] HTTPS y [x] HTTP</w:t>
             </w:r>
@@ -737,10 +1226,10 @@
             <w:tcW w:type="dxa" w:w="2880"/>
             <w:shd w:fill="FFFFFF"/>
             <w:tcMar>
-              <w:top w:w="80" w:type="dxa"/>
-              <w:bottom w:w="80" w:type="dxa"/>
-              <w:left w:w="100" w:type="dxa"/>
-              <w:right w:w="100" w:type="dxa"/>
+              <w:top w:w="70" w:type="dxa"/>
+              <w:bottom w:w="70" w:type="dxa"/>
+              <w:left w:w="90" w:type="dxa"/>
+              <w:right w:w="90" w:type="dxa"/>
             </w:tcMar>
           </w:tcPr>
           <w:p>
@@ -748,7 +1237,7 @@
               <w:rPr>
                 <w:rFonts w:ascii="Segoe UI" w:hAnsi="Segoe UI"/>
                 <w:color w:val="212529"/>
-                <w:sz w:val="19"/>
+                <w:sz w:val="18"/>
               </w:rPr>
               <w:t>Configuración de red</w:t>
             </w:r>
@@ -759,10 +1248,10 @@
             <w:tcW w:type="dxa" w:w="2592"/>
             <w:shd w:fill="FFFFFF"/>
             <w:tcMar>
-              <w:top w:w="80" w:type="dxa"/>
-              <w:bottom w:w="80" w:type="dxa"/>
-              <w:left w:w="100" w:type="dxa"/>
-              <w:right w:w="100" w:type="dxa"/>
+              <w:top w:w="70" w:type="dxa"/>
+              <w:bottom w:w="70" w:type="dxa"/>
+              <w:left w:w="90" w:type="dxa"/>
+              <w:right w:w="90" w:type="dxa"/>
             </w:tcMar>
           </w:tcPr>
           <w:p>
@@ -770,7 +1259,7 @@
               <w:rPr>
                 <w:rFonts w:ascii="Segoe UI" w:hAnsi="Segoe UI"/>
                 <w:color w:val="212529"/>
-                <w:sz w:val="19"/>
+                <w:sz w:val="18"/>
               </w:rPr>
               <w:t>Editar reglas</w:t>
             </w:r>
@@ -781,10 +1270,10 @@
             <w:tcW w:type="dxa" w:w="4320"/>
             <w:shd w:fill="FFFFFF"/>
             <w:tcMar>
-              <w:top w:w="80" w:type="dxa"/>
-              <w:bottom w:w="80" w:type="dxa"/>
-              <w:left w:w="100" w:type="dxa"/>
-              <w:right w:w="100" w:type="dxa"/>
+              <w:top w:w="70" w:type="dxa"/>
+              <w:bottom w:w="70" w:type="dxa"/>
+              <w:left w:w="90" w:type="dxa"/>
+              <w:right w:w="90" w:type="dxa"/>
             </w:tcMar>
           </w:tcPr>
           <w:p>
@@ -792,7 +1281,7 @@
               <w:rPr>
                 <w:rFonts w:ascii="Segoe UI" w:hAnsi="Segoe UI"/>
                 <w:color w:val="212529"/>
-                <w:sz w:val="19"/>
+                <w:sz w:val="18"/>
               </w:rPr>
               <w:t>Clic en Editar -&gt; Agregar regla:</w:t>
               <w:br/>
@@ -811,10 +1300,10 @@
             <w:tcW w:type="dxa" w:w="2880"/>
             <w:shd w:fill="F8F9FA"/>
             <w:tcMar>
-              <w:top w:w="80" w:type="dxa"/>
-              <w:bottom w:w="80" w:type="dxa"/>
-              <w:left w:w="100" w:type="dxa"/>
-              <w:right w:w="100" w:type="dxa"/>
+              <w:top w:w="70" w:type="dxa"/>
+              <w:bottom w:w="70" w:type="dxa"/>
+              <w:left w:w="90" w:type="dxa"/>
+              <w:right w:w="90" w:type="dxa"/>
             </w:tcMar>
           </w:tcPr>
           <w:p>
@@ -822,7 +1311,7 @@
               <w:rPr>
                 <w:rFonts w:ascii="Segoe UI" w:hAnsi="Segoe UI"/>
                 <w:color w:val="212529"/>
-                <w:sz w:val="19"/>
+                <w:sz w:val="18"/>
               </w:rPr>
               <w:t>Almacenamiento</w:t>
             </w:r>
@@ -833,10 +1322,10 @@
             <w:tcW w:type="dxa" w:w="2592"/>
             <w:shd w:fill="F8F9FA"/>
             <w:tcMar>
-              <w:top w:w="80" w:type="dxa"/>
-              <w:bottom w:w="80" w:type="dxa"/>
-              <w:left w:w="100" w:type="dxa"/>
-              <w:right w:w="100" w:type="dxa"/>
+              <w:top w:w="70" w:type="dxa"/>
+              <w:bottom w:w="70" w:type="dxa"/>
+              <w:left w:w="90" w:type="dxa"/>
+              <w:right w:w="90" w:type="dxa"/>
             </w:tcMar>
           </w:tcPr>
           <w:p>
@@ -844,7 +1333,7 @@
               <w:rPr>
                 <w:rFonts w:ascii="Segoe UI" w:hAnsi="Segoe UI"/>
                 <w:color w:val="212529"/>
-                <w:sz w:val="19"/>
+                <w:sz w:val="18"/>
               </w:rPr>
               <w:t>Tamaño de disco</w:t>
             </w:r>
@@ -855,10 +1344,10 @@
             <w:tcW w:type="dxa" w:w="4320"/>
             <w:shd w:fill="F8F9FA"/>
             <w:tcMar>
-              <w:top w:w="80" w:type="dxa"/>
-              <w:bottom w:w="80" w:type="dxa"/>
-              <w:left w:w="100" w:type="dxa"/>
-              <w:right w:w="100" w:type="dxa"/>
+              <w:top w:w="70" w:type="dxa"/>
+              <w:bottom w:w="70" w:type="dxa"/>
+              <w:left w:w="90" w:type="dxa"/>
+              <w:right w:w="90" w:type="dxa"/>
             </w:tcMar>
           </w:tcPr>
           <w:p>
@@ -866,9 +1355,9 @@
               <w:rPr>
                 <w:rFonts w:ascii="Segoe UI" w:hAnsi="Segoe UI"/>
                 <w:color w:val="212529"/>
-                <w:sz w:val="19"/>
+                <w:sz w:val="18"/>
               </w:rPr>
-              <w:t>Cambiar 8 GiB a 20 GiB (gp3)</w:t>
+              <w:t>Cambiar de 8 GiB a 20 GiB (gp3)</w:t>
             </w:r>
           </w:p>
         </w:tc>
@@ -876,87 +1365,104 @@
     </w:tbl>
     <w:p>
       <w:pPr>
-        <w:spacing w:after="120"/>
+        <w:spacing w:after="80"/>
       </w:pPr>
     </w:p>
     <w:p>
       <w:pPr>
         <w:keepNext/>
-        <w:spacing w:before="320" w:after="120"/>
+        <w:spacing w:before="280" w:after="120"/>
       </w:pPr>
       <w:r>
         <w:rPr>
           <w:rFonts w:ascii="Segoe UI" w:hAnsi="Segoe UI"/>
           <w:b/>
           <w:color w:val="104B8E"/>
-          <w:sz w:val="30"/>
+          <w:sz w:val="28"/>
         </w:rPr>
-        <w:t>4. Conectarse a la Máquina Virtual</w:t>
+        <w:t>3. Conectarse a la Máquina Virtual</w:t>
       </w:r>
     </w:p>
     <w:p>
       <w:pPr>
-        <w:spacing w:after="120" w:line="276" w:lineRule="auto"/>
+        <w:spacing w:after="100" w:line="276" w:lineRule="auto"/>
       </w:pPr>
       <w:r>
         <w:rPr>
           <w:rFonts w:ascii="Segoe UI" w:hAnsi="Segoe UI"/>
-          <w:b/>
           <w:color w:val="212529"/>
-          <w:sz w:val="21"/>
+          <w:sz w:val="20"/>
         </w:rPr>
-        <w:t xml:space="preserve">Paso: </w:t>
+        <w:t>1. En la lista de EC2 selecciona la instancia 'reactBootstrap' y haz clic en el botón 'Conectar' (arriba a la izquierda).</w:t>
       </w:r>
+    </w:p>
+    <w:p>
+      <w:pPr>
+        <w:spacing w:after="100" w:line="276" w:lineRule="auto"/>
+      </w:pPr>
       <w:r>
         <w:rPr>
           <w:rFonts w:ascii="Segoe UI" w:hAnsi="Segoe UI"/>
           <w:color w:val="212529"/>
-          <w:sz w:val="21"/>
+          <w:sz w:val="20"/>
         </w:rPr>
-        <w:t>Una vez creada la instancia, en la lista de EC2 selecciónala y haz clic en 'Conectar' (arriba). En la pestaña 'Conexión de la instancia EC2' presiona el botón inferior 'Conectar'. Se abrirá directamente una ventana con la terminal negra de Ubuntu en tu navegador web.</w:t>
+        <w:t>2. En la pestaña 'Conexión de la instancia EC2' presiona el botón 'Conectar' abajo.</w:t>
+      </w:r>
+    </w:p>
+    <w:p>
+      <w:pPr>
+        <w:spacing w:after="100" w:line="276" w:lineRule="auto"/>
+      </w:pPr>
+      <w:r>
+        <w:rPr>
+          <w:rFonts w:ascii="Segoe UI" w:hAnsi="Segoe UI"/>
+          <w:color w:val="212529"/>
+          <w:sz w:val="20"/>
+        </w:rPr>
+        <w:t>3. Se abrirá automáticamente la terminal negra de comandos de Ubuntu en tu navegador.</w:t>
       </w:r>
     </w:p>
     <w:p>
       <w:pPr>
         <w:keepNext/>
-        <w:spacing w:before="320" w:after="120"/>
+        <w:spacing w:before="280" w:after="120"/>
       </w:pPr>
       <w:r>
         <w:rPr>
           <w:rFonts w:ascii="Segoe UI" w:hAnsi="Segoe UI"/>
           <w:b/>
           <w:color w:val="104B8E"/>
-          <w:sz w:val="30"/>
+          <w:sz w:val="28"/>
         </w:rPr>
-        <w:t>5. Comandos directos en la Terminal de AWS</w:t>
+        <w:t>4. Comandos directos en la Terminal de AWS (Pantalla Negra)</w:t>
       </w:r>
     </w:p>
     <w:p>
       <w:pPr>
-        <w:spacing w:after="120" w:line="276" w:lineRule="auto"/>
+        <w:spacing w:after="100" w:line="276" w:lineRule="auto"/>
       </w:pPr>
       <w:r>
         <w:rPr>
           <w:rFonts w:ascii="Segoe UI" w:hAnsi="Segoe UI"/>
           <w:color w:val="212529"/>
-          <w:sz w:val="21"/>
+          <w:sz w:val="20"/>
         </w:rPr>
-        <w:t>Copia y pega estos comandos en la pantalla negra de AWS, en el orden indicado:</w:t>
+        <w:t>Copia y pega estos comandos uno a uno en la terminal de AWS:</w:t>
       </w:r>
     </w:p>
     <w:p>
       <w:pPr>
         <w:keepNext/>
-        <w:spacing w:before="240" w:after="80"/>
+        <w:spacing w:before="200" w:after="80"/>
       </w:pPr>
       <w:r>
         <w:rPr>
           <w:rFonts w:ascii="Segoe UI" w:hAnsi="Segoe UI"/>
           <w:b/>
           <w:color w:val="28A745"/>
-          <w:sz w:val="24"/>
+          <w:sz w:val="23"/>
         </w:rPr>
-        <w:t>Paso 5.1: Actualizar el sistema e instalar NVM</w:t>
+        <w:t>Paso 4.1: Actualizar el servidor</w:t>
       </w:r>
     </w:p>
     <w:tbl>
@@ -975,10 +1481,10 @@
             <w:tcW w:type="dxa" w:w="9936"/>
             <w:shd w:fill="1E1E1E"/>
             <w:tcMar>
-              <w:top w:w="140" w:type="dxa"/>
-              <w:bottom w:w="140" w:type="dxa"/>
-              <w:left w:w="180" w:type="dxa"/>
-              <w:right w:w="180" w:type="dxa"/>
+              <w:top w:w="120" w:type="dxa"/>
+              <w:bottom w:w="120" w:type="dxa"/>
+              <w:left w:w="150" w:type="dxa"/>
+              <w:right w:w="150" w:type="dxa"/>
             </w:tcMar>
           </w:tcPr>
           <w:p>
@@ -989,16 +1495,9 @@
               <w:rPr>
                 <w:rFonts w:ascii="Consolas" w:hAnsi="Consolas"/>
                 <w:color w:val="DCDCDC"/>
-                <w:sz w:val="19"/>
+                <w:sz w:val="18"/>
               </w:rPr>
               <w:t>sudo apt-get update -y</w:t>
-              <w:br/>
-              <w:br/>
-              <w:t>curl -o- https://raw.githubusercontent.com/nvm-sh/nvm/v0.39.3/install.sh | bash</w:t>
-              <w:br/>
-              <w:t>export NVM_DIR="$HOME/.nvm"</w:t>
-              <w:br/>
-              <w:t>[ -s "$NVM_DIR/nvm.sh" ] &amp;&amp; \. "$NVM_DIR/nvm.sh"</w:t>
             </w:r>
           </w:p>
         </w:tc>
@@ -1006,44 +1505,22 @@
     </w:tbl>
     <w:p>
       <w:pPr>
-        <w:spacing w:after="120"/>
+        <w:spacing w:after="80"/>
       </w:pPr>
     </w:p>
     <w:p>
       <w:pPr>
         <w:keepNext/>
-        <w:spacing w:before="240" w:after="80"/>
+        <w:spacing w:before="200" w:after="80"/>
       </w:pPr>
       <w:r>
         <w:rPr>
           <w:rFonts w:ascii="Segoe UI" w:hAnsi="Segoe UI"/>
           <w:b/>
           <w:color w:val="28A745"/>
-          <w:sz w:val="24"/>
+          <w:sz w:val="23"/>
         </w:rPr>
-        <w:t>Paso 5.2: Instalar Node.js versión 22</w:t>
-      </w:r>
-    </w:p>
-    <w:p>
-      <w:pPr>
-        <w:spacing w:after="120" w:line="276" w:lineRule="auto"/>
-      </w:pPr>
-      <w:r>
-        <w:rPr>
-          <w:rFonts w:ascii="Segoe UI" w:hAnsi="Segoe UI"/>
-          <w:b/>
-          <w:color w:val="212529"/>
-          <w:sz w:val="21"/>
-        </w:rPr>
-        <w:t xml:space="preserve">Importante: </w:t>
-      </w:r>
-      <w:r>
-        <w:rPr>
-          <w:rFonts w:ascii="Segoe UI" w:hAnsi="Segoe UI"/>
-          <w:color w:val="212529"/>
-          <w:sz w:val="21"/>
-        </w:rPr>
-        <w:t>Nota: Usamos Node 22 porque las librerías modernas de React y Vite lo requieren para compilar sin errores.</w:t>
+        <w:t>Paso 4.2: Instalar el gestor de versiones NVM</w:t>
       </w:r>
     </w:p>
     <w:tbl>
@@ -1062,10 +1539,10 @@
             <w:tcW w:type="dxa" w:w="9936"/>
             <w:shd w:fill="1E1E1E"/>
             <w:tcMar>
-              <w:top w:w="140" w:type="dxa"/>
-              <w:bottom w:w="140" w:type="dxa"/>
-              <w:left w:w="180" w:type="dxa"/>
-              <w:right w:w="180" w:type="dxa"/>
+              <w:top w:w="120" w:type="dxa"/>
+              <w:bottom w:w="120" w:type="dxa"/>
+              <w:left w:w="150" w:type="dxa"/>
+              <w:right w:w="150" w:type="dxa"/>
             </w:tcMar>
           </w:tcPr>
           <w:p>
@@ -1076,13 +1553,13 @@
               <w:rPr>
                 <w:rFonts w:ascii="Consolas" w:hAnsi="Consolas"/>
                 <w:color w:val="DCDCDC"/>
-                <w:sz w:val="19"/>
+                <w:sz w:val="18"/>
               </w:rPr>
-              <w:t>nvm install 22</w:t>
+              <w:t>curl -o- https://raw.githubusercontent.com/nvm-sh/nvm/v0.39.3/install.sh | bash</w:t>
               <w:br/>
-              <w:t>node -v</w:t>
+              <w:t>export NVM_DIR="$HOME/.nvm"</w:t>
               <w:br/>
-              <w:t>npm -v</w:t>
+              <w:t>[ -s "$NVM_DIR/nvm.sh" ] &amp;&amp; \. "$NVM_DIR/nvm.sh"</w:t>
             </w:r>
           </w:p>
         </w:tc>
@@ -1090,22 +1567,22 @@
     </w:tbl>
     <w:p>
       <w:pPr>
-        <w:spacing w:after="120"/>
+        <w:spacing w:after="80"/>
       </w:pPr>
     </w:p>
     <w:p>
       <w:pPr>
         <w:keepNext/>
-        <w:spacing w:before="240" w:after="80"/>
+        <w:spacing w:before="200" w:after="80"/>
       </w:pPr>
       <w:r>
         <w:rPr>
           <w:rFonts w:ascii="Segoe UI" w:hAnsi="Segoe UI"/>
           <w:b/>
           <w:color w:val="28A745"/>
-          <w:sz w:val="24"/>
+          <w:sz w:val="23"/>
         </w:rPr>
-        <w:t>Paso 5.3: Clonar el proyecto desde GitHub</w:t>
+        <w:t>Paso 4.3: Instalar Node.js versión 22</w:t>
       </w:r>
     </w:p>
     <w:tbl>
@@ -1124,10 +1601,10 @@
             <w:tcW w:type="dxa" w:w="9936"/>
             <w:shd w:fill="1E1E1E"/>
             <w:tcMar>
-              <w:top w:w="140" w:type="dxa"/>
-              <w:bottom w:w="140" w:type="dxa"/>
-              <w:left w:w="180" w:type="dxa"/>
-              <w:right w:w="180" w:type="dxa"/>
+              <w:top w:w="120" w:type="dxa"/>
+              <w:bottom w:w="120" w:type="dxa"/>
+              <w:left w:w="150" w:type="dxa"/>
+              <w:right w:w="150" w:type="dxa"/>
             </w:tcMar>
           </w:tcPr>
           <w:p>
@@ -1138,9 +1615,13 @@
               <w:rPr>
                 <w:rFonts w:ascii="Consolas" w:hAnsi="Consolas"/>
                 <w:color w:val="DCDCDC"/>
-                <w:sz w:val="19"/>
+                <w:sz w:val="18"/>
               </w:rPr>
-              <w:t>git clone https://github.com/drkFenix/FS2_S04_G8.git</w:t>
+              <w:t>nvm install 22</w:t>
+              <w:br/>
+              <w:t>node -v</w:t>
+              <w:br/>
+              <w:t>npm -v</w:t>
             </w:r>
           </w:p>
         </w:tc>
@@ -1148,22 +1629,22 @@
     </w:tbl>
     <w:p>
       <w:pPr>
-        <w:spacing w:after="120"/>
+        <w:spacing w:after="80"/>
       </w:pPr>
     </w:p>
     <w:p>
       <w:pPr>
         <w:keepNext/>
-        <w:spacing w:before="240" w:after="80"/>
+        <w:spacing w:before="200" w:after="80"/>
       </w:pPr>
       <w:r>
         <w:rPr>
           <w:rFonts w:ascii="Segoe UI" w:hAnsi="Segoe UI"/>
           <w:b/>
           <w:color w:val="28A745"/>
-          <w:sz w:val="24"/>
+          <w:sz w:val="23"/>
         </w:rPr>
-        <w:t>Paso 5.4: Entrar a la carpeta e instalar dependencias</w:t>
+        <w:t>Paso 4.4: Clonar tu proyecto de GitHub</w:t>
       </w:r>
     </w:p>
     <w:tbl>
@@ -1182,10 +1663,10 @@
             <w:tcW w:type="dxa" w:w="9936"/>
             <w:shd w:fill="1E1E1E"/>
             <w:tcMar>
-              <w:top w:w="140" w:type="dxa"/>
-              <w:bottom w:w="140" w:type="dxa"/>
-              <w:left w:w="180" w:type="dxa"/>
-              <w:right w:w="180" w:type="dxa"/>
+              <w:top w:w="120" w:type="dxa"/>
+              <w:bottom w:w="120" w:type="dxa"/>
+              <w:left w:w="150" w:type="dxa"/>
+              <w:right w:w="150" w:type="dxa"/>
             </w:tcMar>
           </w:tcPr>
           <w:p>
@@ -1196,11 +1677,9 @@
               <w:rPr>
                 <w:rFonts w:ascii="Consolas" w:hAnsi="Consolas"/>
                 <w:color w:val="DCDCDC"/>
-                <w:sz w:val="19"/>
+                <w:sz w:val="18"/>
               </w:rPr>
-              <w:t>cd FS2_S04_G8/huertohogar-app</w:t>
-              <w:br/>
-              <w:t>npm install</w:t>
+              <w:t>git clone https://github.com/drkFenix/FS2_S04_G8.git</w:t>
             </w:r>
           </w:p>
         </w:tc>
@@ -1208,44 +1687,22 @@
     </w:tbl>
     <w:p>
       <w:pPr>
-        <w:spacing w:after="120"/>
+        <w:spacing w:after="80"/>
       </w:pPr>
     </w:p>
     <w:p>
       <w:pPr>
         <w:keepNext/>
-        <w:spacing w:before="240" w:after="80"/>
+        <w:spacing w:before="200" w:after="80"/>
       </w:pPr>
       <w:r>
         <w:rPr>
           <w:rFonts w:ascii="Segoe UI" w:hAnsi="Segoe UI"/>
           <w:b/>
           <w:color w:val="28A745"/>
-          <w:sz w:val="24"/>
+          <w:sz w:val="23"/>
         </w:rPr>
-        <w:t>Paso 5.5: Dejar la aplicación corriendo permanentemente</w:t>
-      </w:r>
-    </w:p>
-    <w:p>
-      <w:pPr>
-        <w:spacing w:after="120" w:line="276" w:lineRule="auto"/>
-      </w:pPr>
-      <w:r>
-        <w:rPr>
-          <w:rFonts w:ascii="Segoe UI" w:hAnsi="Segoe UI"/>
-          <w:b/>
-          <w:color w:val="212529"/>
-          <w:sz w:val="21"/>
-        </w:rPr>
-        <w:t xml:space="preserve">Servicio en segundo plano: </w:t>
-      </w:r>
-      <w:r>
-        <w:rPr>
-          <w:rFonts w:ascii="Segoe UI" w:hAnsi="Segoe UI"/>
-          <w:color w:val="212529"/>
-          <w:sz w:val="21"/>
-        </w:rPr>
-        <w:t>Para que la página web no se apague cuando cierres la ventana de AWS, usamos el administrador de procesos PM2:</w:t>
+        <w:t>Paso 4.5: Entrar a la carpeta e instalar librerías</w:t>
       </w:r>
     </w:p>
     <w:tbl>
@@ -1264,10 +1721,10 @@
             <w:tcW w:type="dxa" w:w="9936"/>
             <w:shd w:fill="1E1E1E"/>
             <w:tcMar>
-              <w:top w:w="140" w:type="dxa"/>
-              <w:bottom w:w="140" w:type="dxa"/>
-              <w:left w:w="180" w:type="dxa"/>
-              <w:right w:w="180" w:type="dxa"/>
+              <w:top w:w="120" w:type="dxa"/>
+              <w:bottom w:w="120" w:type="dxa"/>
+              <w:left w:w="150" w:type="dxa"/>
+              <w:right w:w="150" w:type="dxa"/>
             </w:tcMar>
           </w:tcPr>
           <w:p>
@@ -1278,7 +1735,89 @@
               <w:rPr>
                 <w:rFonts w:ascii="Consolas" w:hAnsi="Consolas"/>
                 <w:color w:val="DCDCDC"/>
-                <w:sz w:val="19"/>
+                <w:sz w:val="18"/>
+              </w:rPr>
+              <w:t>cd FS2_S04_G8/huertohogar-app</w:t>
+              <w:br/>
+              <w:t>npm install</w:t>
+            </w:r>
+          </w:p>
+        </w:tc>
+      </w:tr>
+    </w:tbl>
+    <w:p>
+      <w:pPr>
+        <w:spacing w:after="80"/>
+      </w:pPr>
+    </w:p>
+    <w:p>
+      <w:pPr>
+        <w:keepNext/>
+        <w:spacing w:before="200" w:after="80"/>
+      </w:pPr>
+      <w:r>
+        <w:rPr>
+          <w:rFonts w:ascii="Segoe UI" w:hAnsi="Segoe UI"/>
+          <w:b/>
+          <w:color w:val="28A745"/>
+          <w:sz w:val="23"/>
+        </w:rPr>
+        <w:t>Paso 4.6: Dejar la aplicación corriendo permanentemente con PM2</w:t>
+      </w:r>
+    </w:p>
+    <w:p>
+      <w:pPr>
+        <w:spacing w:after="100" w:line="276" w:lineRule="auto"/>
+      </w:pPr>
+      <w:r>
+        <w:rPr>
+          <w:rFonts w:ascii="Segoe UI" w:hAnsi="Segoe UI"/>
+          <w:b/>
+          <w:color w:val="212529"/>
+          <w:sz w:val="20"/>
+        </w:rPr>
+        <w:t xml:space="preserve">Ejecución continua: </w:t>
+      </w:r>
+      <w:r>
+        <w:rPr>
+          <w:rFonts w:ascii="Segoe UI" w:hAnsi="Segoe UI"/>
+          <w:color w:val="212529"/>
+          <w:sz w:val="20"/>
+        </w:rPr>
+        <w:t>Con PM2 la aplicación se mantiene en ejecución en segundo plano aunque cierres la ventana:</w:t>
+      </w:r>
+    </w:p>
+    <w:tbl>
+      <w:tblPr>
+        <w:tblW w:type="auto" w:w="0"/>
+        <w:jc w:val="center"/>
+        <w:tblLayout w:type="fixed"/>
+        <w:tblLook w:firstColumn="1" w:firstRow="1" w:lastColumn="0" w:lastRow="0" w:noHBand="0" w:noVBand="1" w:val="04A0"/>
+      </w:tblPr>
+      <w:tblGrid>
+        <w:gridCol w:w="9792"/>
+      </w:tblGrid>
+      <w:tr>
+        <w:tc>
+          <w:tcPr>
+            <w:tcW w:type="dxa" w:w="9936"/>
+            <w:shd w:fill="1E1E1E"/>
+            <w:tcMar>
+              <w:top w:w="120" w:type="dxa"/>
+              <w:bottom w:w="120" w:type="dxa"/>
+              <w:left w:w="150" w:type="dxa"/>
+              <w:right w:w="150" w:type="dxa"/>
+            </w:tcMar>
+          </w:tcPr>
+          <w:p>
+            <w:pPr>
+              <w:spacing w:after="0" w:line="276" w:lineRule="auto"/>
+            </w:pPr>
+            <w:r>
+              <w:rPr>
+                <w:rFonts w:ascii="Consolas" w:hAnsi="Consolas"/>
+                <w:color w:val="DCDCDC"/>
+                <w:sz w:val="18"/>
               </w:rPr>
               <w:t>npm install -g pm2</w:t>
               <w:br/>
@@ -1290,44 +1829,35 @@
     </w:tbl>
     <w:p>
       <w:pPr>
-        <w:spacing w:after="120"/>
+        <w:spacing w:after="80"/>
       </w:pPr>
     </w:p>
     <w:p>
       <w:pPr>
         <w:keepNext/>
-        <w:spacing w:before="320" w:after="120"/>
+        <w:spacing w:before="280" w:after="120"/>
       </w:pPr>
       <w:r>
         <w:rPr>
           <w:rFonts w:ascii="Segoe UI" w:hAnsi="Segoe UI"/>
           <w:b/>
           <w:color w:val="104B8E"/>
-          <w:sz w:val="30"/>
+          <w:sz w:val="28"/>
         </w:rPr>
-        <w:t>6. Abrir la Aplicación en el Navegador (¡Ojo con el enlace!)</w:t>
+        <w:t>5. Abrir la Aplicación en el Navegador</w:t>
       </w:r>
     </w:p>
     <w:p>
       <w:pPr>
-        <w:spacing w:after="120" w:line="276" w:lineRule="auto"/>
+        <w:spacing w:after="100" w:line="276" w:lineRule="auto"/>
       </w:pPr>
       <w:r>
         <w:rPr>
           <w:rFonts w:ascii="Segoe UI" w:hAnsi="Segoe UI"/>
-          <w:b/>
           <w:color w:val="212529"/>
-          <w:sz w:val="21"/>
+          <w:sz w:val="20"/>
         </w:rPr>
-        <w:t xml:space="preserve">Acceso: </w:t>
-      </w:r>
-      <w:r>
-        <w:rPr>
-          <w:rFonts w:ascii="Segoe UI" w:hAnsi="Segoe UI"/>
-          <w:color w:val="212529"/>
-          <w:sz w:val="21"/>
-        </w:rPr>
-        <w:t>Abre tu navegador (Chrome, Edge, etc.) y escribe la dirección de tu servidor:</w:t>
+        <w:t>Copia la IP pública que aparece en el panel de AWS (o en la barra inferior de la terminal) y ábrela en tu navegador:</w:t>
       </w:r>
     </w:p>
     <w:tbl>
@@ -1346,10 +1876,10 @@
             <w:tcW w:type="dxa" w:w="9936"/>
             <w:shd w:fill="D4EDDA"/>
             <w:tcMar>
-              <w:top w:w="140" w:type="dxa"/>
-              <w:bottom w:w="140" w:type="dxa"/>
-              <w:left w:w="180" w:type="dxa"/>
-              <w:right w:w="180" w:type="dxa"/>
+              <w:top w:w="120" w:type="dxa"/>
+              <w:bottom w:w="120" w:type="dxa"/>
+              <w:left w:w="150" w:type="dxa"/>
+              <w:right w:w="150" w:type="dxa"/>
             </w:tcMar>
           </w:tcPr>
           <w:p>
@@ -1361,22 +1891,22 @@
                 <w:rFonts w:ascii="Segoe UI" w:hAnsi="Segoe UI"/>
                 <w:b/>
                 <w:color w:val="104B8E"/>
-                <w:sz w:val="20"/>
+                <w:sz w:val="19"/>
               </w:rPr>
-              <w:t xml:space="preserve">📌 FORMATO DE ENLACE OBLIGATORIO: </w:t>
+              <w:t xml:space="preserve">📌 ENLACE DE ACCESO: </w:t>
             </w:r>
             <w:r>
               <w:rPr>
                 <w:rFonts w:ascii="Segoe UI" w:hAnsi="Segoe UI"/>
                 <w:color w:val="212529"/>
-                <w:sz w:val="20"/>
+                <w:sz w:val="19"/>
               </w:rPr>
               <w:t>http://TU-IP-PUBLICA:3000</w:t>
               <w:br/>
-              <w:t>Ejemplo real: http://34.230.35.62:3000</w:t>
+              <w:t>Ejemplo: http://34.230.35.62:3000</w:t>
               <w:br/>
               <w:br/>
-              <w:t>❌ INCORRECTO: https://34.230.35.62:3000 (dará error SSL PROTOCOL ERROR)</w:t>
+              <w:t>❌ INCORRECTO: https://34.230.35.62:3000 (dará error ERR_SSL_PROTOCOL_ERROR)</w:t>
               <w:br/>
               <w:t>✅ CORRECTO:   http://34.230.35.62:3000 (sin la letra 's')</w:t>
             </w:r>

</xml_diff>

<commit_message>
docs: actualizar guia de despliegue, informe de testing y ERS
</commit_message>
<xml_diff>
--- a/Documentacion/GUIA_DESPLIEGUE_AWS_EC2.docx
+++ b/Documentacion/GUIA_DESPLIEGUE_AWS_EC2.docx
@@ -4,149 +4,90 @@
   <w:body>
     <w:p>
       <w:pPr>
-        <w:spacing w:after="80"/>
-        <w:jc w:val="center"/>
+        <w:pStyle w:val="Title"/>
       </w:pPr>
       <w:r>
+        <w:t>Guía de Despliegue en AWS EC2 - HuertoHogar</w:t>
+      </w:r>
+    </w:p>
+    <w:p>
+      <w:r>
         <w:rPr>
-          <w:rFonts w:ascii="Segoe UI" w:hAnsi="Segoe UI"/>
           <w:b/>
-          <w:color w:val="104B8E"/>
-          <w:sz w:val="44"/>
         </w:rPr>
-        <w:t>Guía del Proyecto y Despliegue en AWS EC2</w:t>
+        <w:t xml:space="preserve">Proyecto: </w:t>
+      </w:r>
+      <w:r>
+        <w:t>HuertoHogar (React + Vite + React-Bootstrap)</w:t>
+        <w:br/>
+      </w:r>
+      <w:r>
+        <w:rPr>
+          <w:b/>
+        </w:rPr>
+        <w:t xml:space="preserve">Asignatura: </w:t>
+      </w:r>
+      <w:r>
+        <w:t>Desarrollo Full Stack II (DSY1104) - Duoc UC</w:t>
+        <w:br/>
+      </w:r>
+      <w:r>
+        <w:rPr>
+          <w:b/>
+        </w:rPr>
+        <w:t xml:space="preserve">Grupo 8: </w:t>
+      </w:r>
+      <w:r>
+        <w:t>Camilo Pérez, Bryan Rodríguez, Hugo Pinto</w:t>
       </w:r>
     </w:p>
     <w:p>
       <w:pPr>
-        <w:spacing w:after="320"/>
-        <w:jc w:val="center"/>
+        <w:pStyle w:val="Heading1"/>
       </w:pPr>
       <w:r>
-        <w:rPr>
-          <w:rFonts w:ascii="Segoe UI" w:hAnsi="Segoe UI"/>
-          <w:color w:val="6C757D"/>
-          <w:sz w:val="23"/>
-        </w:rPr>
-        <w:t>Proyecto: HuertoHogar (React + Bootstrap) | Asignatura: DSY1104 Desarrollo Full Stack II</w:t>
+        <w:t>1. Arquitectura y Componentes del Proyecto</w:t>
       </w:r>
     </w:p>
     <w:p>
-      <w:pPr>
-        <w:keepNext/>
-        <w:spacing w:before="280" w:after="120"/>
-      </w:pPr>
       <w:r>
-        <w:rPr>
-          <w:rFonts w:ascii="Segoe UI" w:hAnsi="Segoe UI"/>
-          <w:b/>
-          <w:color w:val="104B8E"/>
-          <w:sz w:val="28"/>
-        </w:rPr>
-        <w:t>1. Estructura y Funcionamiento del Proyecto (¿Qué es cada cosa?)</w:t>
-      </w:r>
-    </w:p>
-    <w:p>
-      <w:pPr>
-        <w:spacing w:after="100" w:line="276" w:lineRule="auto"/>
-      </w:pPr>
-      <w:r>
-        <w:rPr>
-          <w:rFonts w:ascii="Segoe UI" w:hAnsi="Segoe UI"/>
-          <w:b/>
-          <w:color w:val="212529"/>
-          <w:sz w:val="20"/>
-        </w:rPr>
-        <w:t xml:space="preserve">Resumen de arquitectura: </w:t>
-      </w:r>
-      <w:r>
-        <w:rPr>
-          <w:rFonts w:ascii="Segoe UI" w:hAnsi="Segoe UI"/>
-          <w:color w:val="212529"/>
-          <w:sz w:val="20"/>
-        </w:rPr>
-        <w:t>A continuación se detalla para qué sirve cada carpeta y archivo principal dentro de la aplicación:</w:t>
+        <w:t>La aplicación está construida sobre una arquitectura Single Page Application (SPA) en React:</w:t>
       </w:r>
     </w:p>
     <w:tbl>
       <w:tblPr>
+        <w:tblStyle w:val="TableGrid"/>
         <w:tblW w:type="auto" w:w="0"/>
-        <w:jc w:val="center"/>
-        <w:tblLayout w:type="fixed"/>
         <w:tblLook w:firstColumn="1" w:firstRow="1" w:lastColumn="0" w:lastRow="0" w:noHBand="0" w:noVBand="1" w:val="04A0"/>
       </w:tblPr>
       <w:tblGrid>
-        <w:gridCol w:w="2592"/>
-        <w:gridCol w:w="2304"/>
-        <w:gridCol w:w="4896"/>
+        <w:gridCol w:w="4320"/>
+        <w:gridCol w:w="4320"/>
       </w:tblGrid>
       <w:tr>
         <w:tc>
           <w:tcPr>
-            <w:tcW w:type="dxa" w:w="3312"/>
-            <w:shd w:fill="104B8E"/>
-            <w:tcMar>
-              <w:top w:w="80" w:type="dxa"/>
-              <w:bottom w:w="80" w:type="dxa"/>
-              <w:left w:w="100" w:type="dxa"/>
-              <w:right w:w="100" w:type="dxa"/>
-            </w:tcMar>
+            <w:tcW w:type="dxa" w:w="4320"/>
           </w:tcPr>
           <w:p>
             <w:r>
               <w:rPr>
-                <w:rFonts w:ascii="Segoe UI" w:hAnsi="Segoe UI"/>
                 <w:b/>
-                <w:color w:val="FFFFFF"/>
-                <w:sz w:val="19"/>
               </w:rPr>
-              <w:t>Elemento / Carpeta</w:t>
+              <w:t>Módulo / Archivo</w:t>
             </w:r>
           </w:p>
         </w:tc>
         <w:tc>
           <w:tcPr>
-            <w:tcW w:type="dxa" w:w="3312"/>
-            <w:shd w:fill="104B8E"/>
-            <w:tcMar>
-              <w:top w:w="80" w:type="dxa"/>
-              <w:bottom w:w="80" w:type="dxa"/>
-              <w:left w:w="100" w:type="dxa"/>
-              <w:right w:w="100" w:type="dxa"/>
-            </w:tcMar>
+            <w:tcW w:type="dxa" w:w="4320"/>
           </w:tcPr>
           <w:p>
             <w:r>
               <w:rPr>
-                <w:rFonts w:ascii="Segoe UI" w:hAnsi="Segoe UI"/>
                 <w:b/>
-                <w:color w:val="FFFFFF"/>
-                <w:sz w:val="19"/>
               </w:rPr>
-              <w:t>Concepto clave</w:t>
-            </w:r>
-          </w:p>
-        </w:tc>
-        <w:tc>
-          <w:tcPr>
-            <w:tcW w:type="dxa" w:w="3312"/>
-            <w:shd w:fill="104B8E"/>
-            <w:tcMar>
-              <w:top w:w="80" w:type="dxa"/>
-              <w:bottom w:w="80" w:type="dxa"/>
-              <w:left w:w="100" w:type="dxa"/>
-              <w:right w:w="100" w:type="dxa"/>
-            </w:tcMar>
-          </w:tcPr>
-          <w:p>
-            <w:r>
-              <w:rPr>
-                <w:rFonts w:ascii="Segoe UI" w:hAnsi="Segoe UI"/>
-                <w:b/>
-                <w:color w:val="FFFFFF"/>
-                <w:sz w:val="19"/>
-              </w:rPr>
-              <w:t>Función en HuertoHogar</w:t>
+              <w:t>Rol en la Aplicación</w:t>
             </w:r>
           </w:p>
         </w:tc>
@@ -154,67 +95,21 @@
       <w:tr>
         <w:tc>
           <w:tcPr>
-            <w:tcW w:type="dxa" w:w="2592"/>
-            <w:shd w:fill="F8F9FA"/>
-            <w:tcMar>
-              <w:top w:w="70" w:type="dxa"/>
-              <w:bottom w:w="70" w:type="dxa"/>
-              <w:left w:w="90" w:type="dxa"/>
-              <w:right w:w="90" w:type="dxa"/>
-            </w:tcMar>
+            <w:tcW w:type="dxa" w:w="4320"/>
           </w:tcPr>
           <w:p>
             <w:r>
-              <w:rPr>
-                <w:rFonts w:ascii="Segoe UI" w:hAnsi="Segoe UI"/>
-                <w:color w:val="212529"/>
-                <w:sz w:val="18"/>
-              </w:rPr>
-              <w:t>CartContext</w:t>
+              <w:t>CartContext.jsx</w:t>
             </w:r>
           </w:p>
         </w:tc>
         <w:tc>
           <w:tcPr>
-            <w:tcW w:type="dxa" w:w="2304"/>
-            <w:shd w:fill="F8F9FA"/>
-            <w:tcMar>
-              <w:top w:w="70" w:type="dxa"/>
-              <w:bottom w:w="70" w:type="dxa"/>
-              <w:left w:w="90" w:type="dxa"/>
-              <w:right w:w="90" w:type="dxa"/>
-            </w:tcMar>
+            <w:tcW w:type="dxa" w:w="4320"/>
           </w:tcPr>
           <w:p>
             <w:r>
-              <w:rPr>
-                <w:rFonts w:ascii="Segoe UI" w:hAnsi="Segoe UI"/>
-                <w:color w:val="212529"/>
-                <w:sz w:val="18"/>
-              </w:rPr>
-              <w:t>Lógica y Memoria</w:t>
-            </w:r>
-          </w:p>
-        </w:tc>
-        <w:tc>
-          <w:tcPr>
-            <w:tcW w:type="dxa" w:w="4896"/>
-            <w:shd w:fill="F8F9FA"/>
-            <w:tcMar>
-              <w:top w:w="70" w:type="dxa"/>
-              <w:bottom w:w="70" w:type="dxa"/>
-              <w:left w:w="90" w:type="dxa"/>
-              <w:right w:w="90" w:type="dxa"/>
-            </w:tcMar>
-          </w:tcPr>
-          <w:p>
-            <w:r>
-              <w:rPr>
-                <w:rFonts w:ascii="Segoe UI" w:hAnsi="Segoe UI"/>
-                <w:color w:val="212529"/>
-                <w:sz w:val="18"/>
-              </w:rPr>
-              <w:t>Cerebro central del carrito: guarda los productos seleccionados, calcula el precio total a pagar y provee funciones para agregar, restar o vaciar.</w:t>
+              <w:t>Administra el estado global del carrito de compras, cálculo de subtotales y persistencia con la capa de datos.</w:t>
             </w:r>
           </w:p>
         </w:tc>
@@ -222,67 +117,21 @@
       <w:tr>
         <w:tc>
           <w:tcPr>
-            <w:tcW w:type="dxa" w:w="2592"/>
-            <w:shd w:fill="FFFFFF"/>
-            <w:tcMar>
-              <w:top w:w="70" w:type="dxa"/>
-              <w:bottom w:w="70" w:type="dxa"/>
-              <w:left w:w="90" w:type="dxa"/>
-              <w:right w:w="90" w:type="dxa"/>
-            </w:tcMar>
+            <w:tcW w:type="dxa" w:w="4320"/>
           </w:tcPr>
           <w:p>
             <w:r>
-              <w:rPr>
-                <w:rFonts w:ascii="Segoe UI" w:hAnsi="Segoe UI"/>
-                <w:color w:val="212529"/>
-                <w:sz w:val="18"/>
-              </w:rPr>
-              <w:t>data (db.js)</w:t>
+              <w:t>db.js</w:t>
             </w:r>
           </w:p>
         </w:tc>
         <w:tc>
           <w:tcPr>
-            <w:tcW w:type="dxa" w:w="2304"/>
-            <w:shd w:fill="FFFFFF"/>
-            <w:tcMar>
-              <w:top w:w="70" w:type="dxa"/>
-              <w:bottom w:w="70" w:type="dxa"/>
-              <w:left w:w="90" w:type="dxa"/>
-              <w:right w:w="90" w:type="dxa"/>
-            </w:tcMar>
+            <w:tcW w:type="dxa" w:w="4320"/>
           </w:tcPr>
           <w:p>
             <w:r>
-              <w:rPr>
-                <w:rFonts w:ascii="Segoe UI" w:hAnsi="Segoe UI"/>
-                <w:color w:val="212529"/>
-                <w:sz w:val="18"/>
-              </w:rPr>
-              <w:t>Nuestros Objetos</w:t>
-            </w:r>
-          </w:p>
-        </w:tc>
-        <w:tc>
-          <w:tcPr>
-            <w:tcW w:type="dxa" w:w="4896"/>
-            <w:shd w:fill="FFFFFF"/>
-            <w:tcMar>
-              <w:top w:w="70" w:type="dxa"/>
-              <w:bottom w:w="70" w:type="dxa"/>
-              <w:left w:w="90" w:type="dxa"/>
-              <w:right w:w="90" w:type="dxa"/>
-            </w:tcMar>
-          </w:tcPr>
-          <w:p>
-            <w:r>
-              <w:rPr>
-                <w:rFonts w:ascii="Segoe UI" w:hAnsi="Segoe UI"/>
-                <w:color w:val="212529"/>
-                <w:sz w:val="18"/>
-              </w:rPr>
-              <w:t>Base de datos simulada con los objetos del catálogo: manzanas, naranjas, leche, etc., con su id, precio, stock y categoría.</w:t>
+              <w:t>Mock database en JavaScript que inicializa el catálogo de productos y gestiona la persistencia en localStorage.</w:t>
             </w:r>
           </w:p>
         </w:tc>
@@ -290,67 +139,21 @@
       <w:tr>
         <w:tc>
           <w:tcPr>
-            <w:tcW w:type="dxa" w:w="2592"/>
-            <w:shd w:fill="F8F9FA"/>
-            <w:tcMar>
-              <w:top w:w="70" w:type="dxa"/>
-              <w:bottom w:w="70" w:type="dxa"/>
-              <w:left w:w="90" w:type="dxa"/>
-              <w:right w:w="90" w:type="dxa"/>
-            </w:tcMar>
+            <w:tcW w:type="dxa" w:w="4320"/>
           </w:tcPr>
           <w:p>
             <w:r>
-              <w:rPr>
-                <w:rFonts w:ascii="Segoe UI" w:hAnsi="Segoe UI"/>
-                <w:color w:val="212529"/>
-                <w:sz w:val="18"/>
-              </w:rPr>
-              <w:t>pages</w:t>
+              <w:t>pages/</w:t>
             </w:r>
           </w:p>
         </w:tc>
         <w:tc>
           <w:tcPr>
-            <w:tcW w:type="dxa" w:w="2304"/>
-            <w:shd w:fill="F8F9FA"/>
-            <w:tcMar>
-              <w:top w:w="70" w:type="dxa"/>
-              <w:bottom w:w="70" w:type="dxa"/>
-              <w:left w:w="90" w:type="dxa"/>
-              <w:right w:w="90" w:type="dxa"/>
-            </w:tcMar>
+            <w:tcW w:type="dxa" w:w="4320"/>
           </w:tcPr>
           <w:p>
             <w:r>
-              <w:rPr>
-                <w:rFonts w:ascii="Segoe UI" w:hAnsi="Segoe UI"/>
-                <w:color w:val="212529"/>
-                <w:sz w:val="18"/>
-              </w:rPr>
-              <w:t>Ventanas / Pantallas</w:t>
-            </w:r>
-          </w:p>
-        </w:tc>
-        <w:tc>
-          <w:tcPr>
-            <w:tcW w:type="dxa" w:w="4896"/>
-            <w:shd w:fill="F8F9FA"/>
-            <w:tcMar>
-              <w:top w:w="70" w:type="dxa"/>
-              <w:bottom w:w="70" w:type="dxa"/>
-              <w:left w:w="90" w:type="dxa"/>
-              <w:right w:w="90" w:type="dxa"/>
-            </w:tcMar>
-          </w:tcPr>
-          <w:p>
-            <w:r>
-              <w:rPr>
-                <w:rFonts w:ascii="Segoe UI" w:hAnsi="Segoe UI"/>
-                <w:color w:val="212529"/>
-                <w:sz w:val="18"/>
-              </w:rPr>
-              <w:t>Vistas completas de la tienda: Inicio (Home), Carrito (Cart), Pagar (Checkout), Administrador (AdminProducts), Login y Registro.</w:t>
+              <w:t>Vistas principales de la tienda (Home, Categorias, Ofertas, Cart, Checkout, ProductDetail) y panel administrativo (/admin).</w:t>
             </w:r>
           </w:p>
         </w:tc>
@@ -358,67 +161,21 @@
       <w:tr>
         <w:tc>
           <w:tcPr>
-            <w:tcW w:type="dxa" w:w="2592"/>
-            <w:shd w:fill="FFFFFF"/>
-            <w:tcMar>
-              <w:top w:w="70" w:type="dxa"/>
-              <w:bottom w:w="70" w:type="dxa"/>
-              <w:left w:w="90" w:type="dxa"/>
-              <w:right w:w="90" w:type="dxa"/>
-            </w:tcMar>
+            <w:tcW w:type="dxa" w:w="4320"/>
           </w:tcPr>
           <w:p>
             <w:r>
-              <w:rPr>
-                <w:rFonts w:ascii="Segoe UI" w:hAnsi="Segoe UI"/>
-                <w:color w:val="212529"/>
-                <w:sz w:val="18"/>
-              </w:rPr>
-              <w:t>components</w:t>
+              <w:t>components/</w:t>
             </w:r>
           </w:p>
         </w:tc>
         <w:tc>
           <w:tcPr>
-            <w:tcW w:type="dxa" w:w="2304"/>
-            <w:shd w:fill="FFFFFF"/>
-            <w:tcMar>
-              <w:top w:w="70" w:type="dxa"/>
-              <w:bottom w:w="70" w:type="dxa"/>
-              <w:left w:w="90" w:type="dxa"/>
-              <w:right w:w="90" w:type="dxa"/>
-            </w:tcMar>
+            <w:tcW w:type="dxa" w:w="4320"/>
           </w:tcPr>
           <w:p>
             <w:r>
-              <w:rPr>
-                <w:rFonts w:ascii="Segoe UI" w:hAnsi="Segoe UI"/>
-                <w:color w:val="212529"/>
-                <w:sz w:val="18"/>
-              </w:rPr>
-              <w:t>Piezas Reutilizables</w:t>
-            </w:r>
-          </w:p>
-        </w:tc>
-        <w:tc>
-          <w:tcPr>
-            <w:tcW w:type="dxa" w:w="4896"/>
-            <w:shd w:fill="FFFFFF"/>
-            <w:tcMar>
-              <w:top w:w="70" w:type="dxa"/>
-              <w:bottom w:w="70" w:type="dxa"/>
-              <w:left w:w="90" w:type="dxa"/>
-              <w:right w:w="90" w:type="dxa"/>
-            </w:tcMar>
-          </w:tcPr>
-          <w:p>
-            <w:r>
-              <w:rPr>
-                <w:rFonts w:ascii="Segoe UI" w:hAnsi="Segoe UI"/>
-                <w:color w:val="212529"/>
-                <w:sz w:val="18"/>
-              </w:rPr>
-              <w:t>Bloques que arman la página: Navbar (encabezado/menú), Footer (pie de página) y ProductCard (tarjeta de cada producto).</w:t>
+              <w:t>Componentes modulares reutilizables (Navbar, Footer, ProductCard).</w:t>
             </w:r>
           </w:p>
         </w:tc>
@@ -426,67 +183,21 @@
       <w:tr>
         <w:tc>
           <w:tcPr>
-            <w:tcW w:type="dxa" w:w="2592"/>
-            <w:shd w:fill="F8F9FA"/>
-            <w:tcMar>
-              <w:top w:w="70" w:type="dxa"/>
-              <w:bottom w:w="70" w:type="dxa"/>
-              <w:left w:w="90" w:type="dxa"/>
-              <w:right w:w="90" w:type="dxa"/>
-            </w:tcMar>
+            <w:tcW w:type="dxa" w:w="4320"/>
           </w:tcPr>
           <w:p>
             <w:r>
-              <w:rPr>
-                <w:rFonts w:ascii="Segoe UI" w:hAnsi="Segoe UI"/>
-                <w:color w:val="212529"/>
-                <w:sz w:val="18"/>
-              </w:rPr>
-              <w:t>assets (public/assets)</w:t>
+              <w:t>public/assets/</w:t>
             </w:r>
           </w:p>
         </w:tc>
         <w:tc>
           <w:tcPr>
-            <w:tcW w:type="dxa" w:w="2304"/>
-            <w:shd w:fill="F8F9FA"/>
-            <w:tcMar>
-              <w:top w:w="70" w:type="dxa"/>
-              <w:bottom w:w="70" w:type="dxa"/>
-              <w:left w:w="90" w:type="dxa"/>
-              <w:right w:w="90" w:type="dxa"/>
-            </w:tcMar>
+            <w:tcW w:type="dxa" w:w="4320"/>
           </w:tcPr>
           <w:p>
             <w:r>
-              <w:rPr>
-                <w:rFonts w:ascii="Segoe UI" w:hAnsi="Segoe UI"/>
-                <w:color w:val="212529"/>
-                <w:sz w:val="18"/>
-              </w:rPr>
-              <w:t>Imágenes</w:t>
-            </w:r>
-          </w:p>
-        </w:tc>
-        <w:tc>
-          <w:tcPr>
-            <w:tcW w:type="dxa" w:w="4896"/>
-            <w:shd w:fill="F8F9FA"/>
-            <w:tcMar>
-              <w:top w:w="70" w:type="dxa"/>
-              <w:bottom w:w="70" w:type="dxa"/>
-              <w:left w:w="90" w:type="dxa"/>
-              <w:right w:w="90" w:type="dxa"/>
-            </w:tcMar>
-          </w:tcPr>
-          <w:p>
-            <w:r>
-              <w:rPr>
-                <w:rFonts w:ascii="Segoe UI" w:hAnsi="Segoe UI"/>
-                <w:color w:val="212529"/>
-                <w:sz w:val="18"/>
-              </w:rPr>
-              <w:t>Carpeta pública donde se alojan las fotos de los productos (manzanas.jpg, platanos.png, logo.png) para que carguen directo en la web.</w:t>
+              <w:t>Archivos estáticos e imágenes del catálogo de productos y logotipo institucional.</w:t>
             </w:r>
           </w:p>
         </w:tc>
@@ -494,67 +205,21 @@
       <w:tr>
         <w:tc>
           <w:tcPr>
-            <w:tcW w:type="dxa" w:w="2592"/>
-            <w:shd w:fill="FFFFFF"/>
-            <w:tcMar>
-              <w:top w:w="70" w:type="dxa"/>
-              <w:bottom w:w="70" w:type="dxa"/>
-              <w:left w:w="90" w:type="dxa"/>
-              <w:right w:w="90" w:type="dxa"/>
-            </w:tcMar>
+            <w:tcW w:type="dxa" w:w="4320"/>
           </w:tcPr>
           <w:p>
             <w:r>
-              <w:rPr>
-                <w:rFonts w:ascii="Segoe UI" w:hAnsi="Segoe UI"/>
-                <w:color w:val="212529"/>
-                <w:sz w:val="18"/>
-              </w:rPr>
-              <w:t>__tests__ (test)</w:t>
+              <w:t>__tests__/</w:t>
             </w:r>
           </w:p>
         </w:tc>
         <w:tc>
           <w:tcPr>
-            <w:tcW w:type="dxa" w:w="2304"/>
-            <w:shd w:fill="FFFFFF"/>
-            <w:tcMar>
-              <w:top w:w="70" w:type="dxa"/>
-              <w:bottom w:w="70" w:type="dxa"/>
-              <w:left w:w="90" w:type="dxa"/>
-              <w:right w:w="90" w:type="dxa"/>
-            </w:tcMar>
+            <w:tcW w:type="dxa" w:w="4320"/>
           </w:tcPr>
           <w:p>
             <w:r>
-              <w:rPr>
-                <w:rFonts w:ascii="Segoe UI" w:hAnsi="Segoe UI"/>
-                <w:color w:val="212529"/>
-                <w:sz w:val="18"/>
-              </w:rPr>
-              <w:t>Pruebas Unitarias</w:t>
-            </w:r>
-          </w:p>
-        </w:tc>
-        <w:tc>
-          <w:tcPr>
-            <w:tcW w:type="dxa" w:w="4896"/>
-            <w:shd w:fill="FFFFFF"/>
-            <w:tcMar>
-              <w:top w:w="70" w:type="dxa"/>
-              <w:bottom w:w="70" w:type="dxa"/>
-              <w:left w:w="90" w:type="dxa"/>
-              <w:right w:w="90" w:type="dxa"/>
-            </w:tcMar>
-          </w:tcPr>
-          <w:p>
-            <w:r>
-              <w:rPr>
-                <w:rFonts w:ascii="Segoe UI" w:hAnsi="Segoe UI"/>
-                <w:color w:val="212529"/>
-                <w:sz w:val="18"/>
-              </w:rPr>
-              <w:t>Pruebas automáticas que validan que el carrito sume bien y que el CRUD funcione correctamente sin errores.</w:t>
+              <w:t>Suite de pruebas unitarias implementadas con Vitest y React Testing Library.</w:t>
             </w:r>
           </w:p>
         </w:tc>
@@ -562,203 +227,21 @@
       <w:tr>
         <w:tc>
           <w:tcPr>
-            <w:tcW w:type="dxa" w:w="2592"/>
-            <w:shd w:fill="F8F9FA"/>
-            <w:tcMar>
-              <w:top w:w="70" w:type="dxa"/>
-              <w:bottom w:w="70" w:type="dxa"/>
-              <w:left w:w="90" w:type="dxa"/>
-              <w:right w:w="90" w:type="dxa"/>
-            </w:tcMar>
+            <w:tcW w:type="dxa" w:w="4320"/>
           </w:tcPr>
           <w:p>
             <w:r>
-              <w:rPr>
-                <w:rFonts w:ascii="Segoe UI" w:hAnsi="Segoe UI"/>
-                <w:color w:val="212529"/>
-                <w:sz w:val="18"/>
-              </w:rPr>
-              <w:t>main.jsx</w:t>
+              <w:t>main.jsx / App.jsx</w:t>
             </w:r>
           </w:p>
         </w:tc>
         <w:tc>
           <w:tcPr>
-            <w:tcW w:type="dxa" w:w="2304"/>
-            <w:shd w:fill="F8F9FA"/>
-            <w:tcMar>
-              <w:top w:w="70" w:type="dxa"/>
-              <w:bottom w:w="70" w:type="dxa"/>
-              <w:left w:w="90" w:type="dxa"/>
-              <w:right w:w="90" w:type="dxa"/>
-            </w:tcMar>
+            <w:tcW w:type="dxa" w:w="4320"/>
           </w:tcPr>
           <w:p>
             <w:r>
-              <w:rPr>
-                <w:rFonts w:ascii="Segoe UI" w:hAnsi="Segoe UI"/>
-                <w:color w:val="212529"/>
-                <w:sz w:val="18"/>
-              </w:rPr>
-              <w:t>Punto de Partida</w:t>
-            </w:r>
-          </w:p>
-        </w:tc>
-        <w:tc>
-          <w:tcPr>
-            <w:tcW w:type="dxa" w:w="4896"/>
-            <w:shd w:fill="F8F9FA"/>
-            <w:tcMar>
-              <w:top w:w="70" w:type="dxa"/>
-              <w:bottom w:w="70" w:type="dxa"/>
-              <w:left w:w="90" w:type="dxa"/>
-              <w:right w:w="90" w:type="dxa"/>
-            </w:tcMar>
-          </w:tcPr>
-          <w:p>
-            <w:r>
-              <w:rPr>
-                <w:rFonts w:ascii="Segoe UI" w:hAnsi="Segoe UI"/>
-                <w:color w:val="212529"/>
-                <w:sz w:val="18"/>
-              </w:rPr>
-              <w:t>Primer archivo que se ejecuta al abrir la web; inyecta React en el HTML principal.</w:t>
-            </w:r>
-          </w:p>
-        </w:tc>
-      </w:tr>
-      <w:tr>
-        <w:tc>
-          <w:tcPr>
-            <w:tcW w:type="dxa" w:w="2592"/>
-            <w:shd w:fill="FFFFFF"/>
-            <w:tcMar>
-              <w:top w:w="70" w:type="dxa"/>
-              <w:bottom w:w="70" w:type="dxa"/>
-              <w:left w:w="90" w:type="dxa"/>
-              <w:right w:w="90" w:type="dxa"/>
-            </w:tcMar>
-          </w:tcPr>
-          <w:p>
-            <w:r>
-              <w:rPr>
-                <w:rFonts w:ascii="Segoe UI" w:hAnsi="Segoe UI"/>
-                <w:color w:val="212529"/>
-                <w:sz w:val="18"/>
-              </w:rPr>
-              <w:t>App.jsx</w:t>
-            </w:r>
-          </w:p>
-        </w:tc>
-        <w:tc>
-          <w:tcPr>
-            <w:tcW w:type="dxa" w:w="2304"/>
-            <w:shd w:fill="FFFFFF"/>
-            <w:tcMar>
-              <w:top w:w="70" w:type="dxa"/>
-              <w:bottom w:w="70" w:type="dxa"/>
-              <w:left w:w="90" w:type="dxa"/>
-              <w:right w:w="90" w:type="dxa"/>
-            </w:tcMar>
-          </w:tcPr>
-          <w:p>
-            <w:r>
-              <w:rPr>
-                <w:rFonts w:ascii="Segoe UI" w:hAnsi="Segoe UI"/>
-                <w:color w:val="212529"/>
-                <w:sz w:val="18"/>
-              </w:rPr>
-              <w:t>Organizador Maestro</w:t>
-            </w:r>
-          </w:p>
-        </w:tc>
-        <w:tc>
-          <w:tcPr>
-            <w:tcW w:type="dxa" w:w="4896"/>
-            <w:shd w:fill="FFFFFF"/>
-            <w:tcMar>
-              <w:top w:w="70" w:type="dxa"/>
-              <w:bottom w:w="70" w:type="dxa"/>
-              <w:left w:w="90" w:type="dxa"/>
-              <w:right w:w="90" w:type="dxa"/>
-            </w:tcMar>
-          </w:tcPr>
-          <w:p>
-            <w:r>
-              <w:rPr>
-                <w:rFonts w:ascii="Segoe UI" w:hAnsi="Segoe UI"/>
-                <w:color w:val="212529"/>
-                <w:sz w:val="18"/>
-              </w:rPr>
-              <w:t>Conecta las rutas del menú, coloca el Navbar arriba, el Footer abajo y muestra la página correspondiente.</w:t>
-            </w:r>
-          </w:p>
-        </w:tc>
-      </w:tr>
-      <w:tr>
-        <w:tc>
-          <w:tcPr>
-            <w:tcW w:type="dxa" w:w="2592"/>
-            <w:shd w:fill="F8F9FA"/>
-            <w:tcMar>
-              <w:top w:w="70" w:type="dxa"/>
-              <w:bottom w:w="70" w:type="dxa"/>
-              <w:left w:w="90" w:type="dxa"/>
-              <w:right w:w="90" w:type="dxa"/>
-            </w:tcMar>
-          </w:tcPr>
-          <w:p>
-            <w:r>
-              <w:rPr>
-                <w:rFonts w:ascii="Segoe UI" w:hAnsi="Segoe UI"/>
-                <w:color w:val="212529"/>
-                <w:sz w:val="18"/>
-              </w:rPr>
-              <w:t>index.css / App.css</w:t>
-            </w:r>
-          </w:p>
-        </w:tc>
-        <w:tc>
-          <w:tcPr>
-            <w:tcW w:type="dxa" w:w="2304"/>
-            <w:shd w:fill="F8F9FA"/>
-            <w:tcMar>
-              <w:top w:w="70" w:type="dxa"/>
-              <w:bottom w:w="70" w:type="dxa"/>
-              <w:left w:w="90" w:type="dxa"/>
-              <w:right w:w="90" w:type="dxa"/>
-            </w:tcMar>
-          </w:tcPr>
-          <w:p>
-            <w:r>
-              <w:rPr>
-                <w:rFonts w:ascii="Segoe UI" w:hAnsi="Segoe UI"/>
-                <w:color w:val="212529"/>
-                <w:sz w:val="18"/>
-              </w:rPr>
-              <w:t>Estilos Visuales</w:t>
-            </w:r>
-          </w:p>
-        </w:tc>
-        <w:tc>
-          <w:tcPr>
-            <w:tcW w:type="dxa" w:w="4896"/>
-            <w:shd w:fill="F8F9FA"/>
-            <w:tcMar>
-              <w:top w:w="70" w:type="dxa"/>
-              <w:bottom w:w="70" w:type="dxa"/>
-              <w:left w:w="90" w:type="dxa"/>
-              <w:right w:w="90" w:type="dxa"/>
-            </w:tcMar>
-          </w:tcPr>
-          <w:p>
-            <w:r>
-              <w:rPr>
-                <w:rFonts w:ascii="Segoe UI" w:hAnsi="Segoe UI"/>
-                <w:color w:val="212529"/>
-                <w:sz w:val="18"/>
-              </w:rPr>
-              <w:t>index.css define fuentes y colores globales; App.css aplica los estilos de tarjetas y botones.</w:t>
+              <w:t>Punto de entrada del cliente, configuración del router (react-router-dom) y del contenedor de contexto.</w:t>
             </w:r>
           </w:p>
         </w:tc>
@@ -766,1162 +249,200 @@
     </w:tbl>
     <w:p>
       <w:pPr>
-        <w:spacing w:after="80"/>
+        <w:pStyle w:val="Heading1"/>
       </w:pPr>
+      <w:r>
+        <w:t>2. Parámetros para la Instancia EC2 (AWS Academy / Learner Lab)</w:t>
+      </w:r>
     </w:p>
     <w:p>
-      <w:pPr>
-        <w:keepNext/>
-        <w:spacing w:before="280" w:after="120"/>
-      </w:pPr>
       <w:r>
-        <w:rPr>
-          <w:rFonts w:ascii="Segoe UI" w:hAnsi="Segoe UI"/>
-          <w:b/>
-          <w:color w:val="104B8E"/>
-          <w:sz w:val="28"/>
-        </w:rPr>
-        <w:t>2. Parámetros exactos para Crear la Instancia en AWS EC2</w:t>
+        <w:t>En la consola de Amazon EC2, ingresar a Launch Instances (Lanzar instancias) y configurar los siguientes valores:</w:t>
+      </w:r>
+    </w:p>
+    <w:p>
+      <w:r>
+        <w:t>1. Name: reactBootstrap</w:t>
+      </w:r>
+    </w:p>
+    <w:p>
+      <w:r>
+        <w:t>2. AMI: Ubuntu Server 24.04 LTS o Ubuntu Server 22.04 LTS (64-bit x86).</w:t>
+      </w:r>
+    </w:p>
+    <w:p>
+      <w:r>
+        <w:t>3. Instance Type: t2.micro o t3.micro (disponible en la capa educativa de AWS Academy).</w:t>
+      </w:r>
+    </w:p>
+    <w:p>
+      <w:r>
+        <w:t>4. Key Pair (Par de claves): Crear un nuevo par de claves (ej: userReact.pem, tipo RSA) o seleccionar uno existente.</w:t>
+      </w:r>
+    </w:p>
+    <w:p>
+      <w:r>
+        <w:t>5. Network Settings (Configuración de red):</w:t>
+        <w:br/>
+        <w:t xml:space="preserve">   - Habilitar tráfico HTTP y HTTPS.</w:t>
+        <w:br/>
+        <w:t xml:space="preserve">   - En Reglas de Security Group (Inbound Rules), agregar regla TCP personalizado, puerto 3000, origen 0.0.0.0/0 (Anywhere IPv4).</w:t>
+      </w:r>
+    </w:p>
+    <w:p>
+      <w:r>
+        <w:t>6. Storage (Almacenamiento): 20 GiB (gp3).</w:t>
       </w:r>
     </w:p>
     <w:p>
       <w:pPr>
-        <w:spacing w:after="100" w:line="276" w:lineRule="auto"/>
+        <w:pStyle w:val="Heading1"/>
       </w:pPr>
       <w:r>
-        <w:rPr>
-          <w:rFonts w:ascii="Segoe UI" w:hAnsi="Segoe UI"/>
-          <w:color w:val="212529"/>
-          <w:sz w:val="20"/>
-        </w:rPr>
-        <w:t>Al entrar a la consola de AWS EC2 y presionar el botón naranja 'Lanzar instancias', completa únicamente estos datos:</w:t>
+        <w:t>3. Conexión a la Instancia</w:t>
       </w:r>
     </w:p>
-    <w:tbl>
-      <w:tblPr>
-        <w:tblW w:type="auto" w:w="0"/>
-        <w:jc w:val="center"/>
-        <w:tblLayout w:type="fixed"/>
-        <w:tblLook w:firstColumn="1" w:firstRow="1" w:lastColumn="0" w:lastRow="0" w:noHBand="0" w:noVBand="1" w:val="04A0"/>
-      </w:tblPr>
-      <w:tblGrid>
-        <w:gridCol w:w="2880"/>
-        <w:gridCol w:w="2592"/>
-        <w:gridCol w:w="4320"/>
-      </w:tblGrid>
-      <w:tr>
-        <w:tc>
-          <w:tcPr>
-            <w:tcW w:type="dxa" w:w="3312"/>
-            <w:shd w:fill="104B8E"/>
-            <w:tcMar>
-              <w:top w:w="80" w:type="dxa"/>
-              <w:bottom w:w="80" w:type="dxa"/>
-              <w:left w:w="100" w:type="dxa"/>
-              <w:right w:w="100" w:type="dxa"/>
-            </w:tcMar>
-          </w:tcPr>
-          <w:p>
-            <w:r>
-              <w:rPr>
-                <w:rFonts w:ascii="Segoe UI" w:hAnsi="Segoe UI"/>
-                <w:b/>
-                <w:color w:val="FFFFFF"/>
-                <w:sz w:val="19"/>
-              </w:rPr>
-              <w:t>Sección en AWS</w:t>
-            </w:r>
-          </w:p>
-        </w:tc>
-        <w:tc>
-          <w:tcPr>
-            <w:tcW w:type="dxa" w:w="3312"/>
-            <w:shd w:fill="104B8E"/>
-            <w:tcMar>
-              <w:top w:w="80" w:type="dxa"/>
-              <w:bottom w:w="80" w:type="dxa"/>
-              <w:left w:w="100" w:type="dxa"/>
-              <w:right w:w="100" w:type="dxa"/>
-            </w:tcMar>
-          </w:tcPr>
-          <w:p>
-            <w:r>
-              <w:rPr>
-                <w:rFonts w:ascii="Segoe UI" w:hAnsi="Segoe UI"/>
-                <w:b/>
-                <w:color w:val="FFFFFF"/>
-                <w:sz w:val="19"/>
-              </w:rPr>
-              <w:t>Campo</w:t>
-            </w:r>
-          </w:p>
-        </w:tc>
-        <w:tc>
-          <w:tcPr>
-            <w:tcW w:type="dxa" w:w="3312"/>
-            <w:shd w:fill="104B8E"/>
-            <w:tcMar>
-              <w:top w:w="80" w:type="dxa"/>
-              <w:bottom w:w="80" w:type="dxa"/>
-              <w:left w:w="100" w:type="dxa"/>
-              <w:right w:w="100" w:type="dxa"/>
-            </w:tcMar>
-          </w:tcPr>
-          <w:p>
-            <w:r>
-              <w:rPr>
-                <w:rFonts w:ascii="Segoe UI" w:hAnsi="Segoe UI"/>
-                <w:b/>
-                <w:color w:val="FFFFFF"/>
-                <w:sz w:val="19"/>
-              </w:rPr>
-              <w:t>Valor a colocar</w:t>
-            </w:r>
-          </w:p>
-        </w:tc>
-      </w:tr>
-      <w:tr>
-        <w:tc>
-          <w:tcPr>
-            <w:tcW w:type="dxa" w:w="2880"/>
-            <w:shd w:fill="F8F9FA"/>
-            <w:tcMar>
-              <w:top w:w="70" w:type="dxa"/>
-              <w:bottom w:w="70" w:type="dxa"/>
-              <w:left w:w="90" w:type="dxa"/>
-              <w:right w:w="90" w:type="dxa"/>
-            </w:tcMar>
-          </w:tcPr>
-          <w:p>
-            <w:r>
-              <w:rPr>
-                <w:rFonts w:ascii="Segoe UI" w:hAnsi="Segoe UI"/>
-                <w:color w:val="212529"/>
-                <w:sz w:val="18"/>
-              </w:rPr>
-              <w:t>Nombre y etiquetas</w:t>
-            </w:r>
-          </w:p>
-        </w:tc>
-        <w:tc>
-          <w:tcPr>
-            <w:tcW w:type="dxa" w:w="2592"/>
-            <w:shd w:fill="F8F9FA"/>
-            <w:tcMar>
-              <w:top w:w="70" w:type="dxa"/>
-              <w:bottom w:w="70" w:type="dxa"/>
-              <w:left w:w="90" w:type="dxa"/>
-              <w:right w:w="90" w:type="dxa"/>
-            </w:tcMar>
-          </w:tcPr>
-          <w:p>
-            <w:r>
-              <w:rPr>
-                <w:rFonts w:ascii="Segoe UI" w:hAnsi="Segoe UI"/>
-                <w:color w:val="212529"/>
-                <w:sz w:val="18"/>
-              </w:rPr>
-              <w:t>Nombre</w:t>
-            </w:r>
-          </w:p>
-        </w:tc>
-        <w:tc>
-          <w:tcPr>
-            <w:tcW w:type="dxa" w:w="4320"/>
-            <w:shd w:fill="F8F9FA"/>
-            <w:tcMar>
-              <w:top w:w="70" w:type="dxa"/>
-              <w:bottom w:w="70" w:type="dxa"/>
-              <w:left w:w="90" w:type="dxa"/>
-              <w:right w:w="90" w:type="dxa"/>
-            </w:tcMar>
-          </w:tcPr>
-          <w:p>
-            <w:r>
-              <w:rPr>
-                <w:rFonts w:ascii="Segoe UI" w:hAnsi="Segoe UI"/>
-                <w:color w:val="212529"/>
-                <w:sz w:val="18"/>
-              </w:rPr>
-              <w:t>reactBootstrap</w:t>
-            </w:r>
-          </w:p>
-        </w:tc>
-      </w:tr>
-      <w:tr>
-        <w:tc>
-          <w:tcPr>
-            <w:tcW w:type="dxa" w:w="2880"/>
-            <w:shd w:fill="FFFFFF"/>
-            <w:tcMar>
-              <w:top w:w="70" w:type="dxa"/>
-              <w:bottom w:w="70" w:type="dxa"/>
-              <w:left w:w="90" w:type="dxa"/>
-              <w:right w:w="90" w:type="dxa"/>
-            </w:tcMar>
-          </w:tcPr>
-          <w:p>
-            <w:r>
-              <w:rPr>
-                <w:rFonts w:ascii="Segoe UI" w:hAnsi="Segoe UI"/>
-                <w:color w:val="212529"/>
-                <w:sz w:val="18"/>
-              </w:rPr>
-              <w:t>Imágenes de software (AMI)</w:t>
-            </w:r>
-          </w:p>
-        </w:tc>
-        <w:tc>
-          <w:tcPr>
-            <w:tcW w:type="dxa" w:w="2592"/>
-            <w:shd w:fill="FFFFFF"/>
-            <w:tcMar>
-              <w:top w:w="70" w:type="dxa"/>
-              <w:bottom w:w="70" w:type="dxa"/>
-              <w:left w:w="90" w:type="dxa"/>
-              <w:right w:w="90" w:type="dxa"/>
-            </w:tcMar>
-          </w:tcPr>
-          <w:p>
-            <w:r>
-              <w:rPr>
-                <w:rFonts w:ascii="Segoe UI" w:hAnsi="Segoe UI"/>
-                <w:color w:val="212529"/>
-                <w:sz w:val="18"/>
-              </w:rPr>
-              <w:t>Sistema Operativo</w:t>
-            </w:r>
-          </w:p>
-        </w:tc>
-        <w:tc>
-          <w:tcPr>
-            <w:tcW w:type="dxa" w:w="4320"/>
-            <w:shd w:fill="FFFFFF"/>
-            <w:tcMar>
-              <w:top w:w="70" w:type="dxa"/>
-              <w:bottom w:w="70" w:type="dxa"/>
-              <w:left w:w="90" w:type="dxa"/>
-              <w:right w:w="90" w:type="dxa"/>
-            </w:tcMar>
-          </w:tcPr>
-          <w:p>
-            <w:r>
-              <w:rPr>
-                <w:rFonts w:ascii="Segoe UI" w:hAnsi="Segoe UI"/>
-                <w:color w:val="212529"/>
-                <w:sz w:val="18"/>
-              </w:rPr>
-              <w:t>Clic en recuadro naranja 'Ubuntu' (Ubuntu 22.04 o 24.04 LTS)</w:t>
-            </w:r>
-          </w:p>
-        </w:tc>
-      </w:tr>
-      <w:tr>
-        <w:tc>
-          <w:tcPr>
-            <w:tcW w:type="dxa" w:w="2880"/>
-            <w:shd w:fill="F8F9FA"/>
-            <w:tcMar>
-              <w:top w:w="70" w:type="dxa"/>
-              <w:bottom w:w="70" w:type="dxa"/>
-              <w:left w:w="90" w:type="dxa"/>
-              <w:right w:w="90" w:type="dxa"/>
-            </w:tcMar>
-          </w:tcPr>
-          <w:p>
-            <w:r>
-              <w:rPr>
-                <w:rFonts w:ascii="Segoe UI" w:hAnsi="Segoe UI"/>
-                <w:color w:val="212529"/>
-                <w:sz w:val="18"/>
-              </w:rPr>
-              <w:t>Tipo de instancia</w:t>
-            </w:r>
-          </w:p>
-        </w:tc>
-        <w:tc>
-          <w:tcPr>
-            <w:tcW w:type="dxa" w:w="2592"/>
-            <w:shd w:fill="F8F9FA"/>
-            <w:tcMar>
-              <w:top w:w="70" w:type="dxa"/>
-              <w:bottom w:w="70" w:type="dxa"/>
-              <w:left w:w="90" w:type="dxa"/>
-              <w:right w:w="90" w:type="dxa"/>
-            </w:tcMar>
-          </w:tcPr>
-          <w:p>
-            <w:r>
-              <w:rPr>
-                <w:rFonts w:ascii="Segoe UI" w:hAnsi="Segoe UI"/>
-                <w:color w:val="212529"/>
-                <w:sz w:val="18"/>
-              </w:rPr>
-              <w:t>Tipo de servidor</w:t>
-            </w:r>
-          </w:p>
-        </w:tc>
-        <w:tc>
-          <w:tcPr>
-            <w:tcW w:type="dxa" w:w="4320"/>
-            <w:shd w:fill="F8F9FA"/>
-            <w:tcMar>
-              <w:top w:w="70" w:type="dxa"/>
-              <w:bottom w:w="70" w:type="dxa"/>
-              <w:left w:w="90" w:type="dxa"/>
-              <w:right w:w="90" w:type="dxa"/>
-            </w:tcMar>
-          </w:tcPr>
-          <w:p>
-            <w:r>
-              <w:rPr>
-                <w:rFonts w:ascii="Segoe UI" w:hAnsi="Segoe UI"/>
-                <w:color w:val="212529"/>
-                <w:sz w:val="18"/>
-              </w:rPr>
-              <w:t>t2.micro o t3.micro (Apto para capa gratuita)</w:t>
-            </w:r>
-          </w:p>
-        </w:tc>
-      </w:tr>
-      <w:tr>
-        <w:tc>
-          <w:tcPr>
-            <w:tcW w:type="dxa" w:w="2880"/>
-            <w:shd w:fill="FFFFFF"/>
-            <w:tcMar>
-              <w:top w:w="70" w:type="dxa"/>
-              <w:bottom w:w="70" w:type="dxa"/>
-              <w:left w:w="90" w:type="dxa"/>
-              <w:right w:w="90" w:type="dxa"/>
-            </w:tcMar>
-          </w:tcPr>
-          <w:p>
-            <w:r>
-              <w:rPr>
-                <w:rFonts w:ascii="Segoe UI" w:hAnsi="Segoe UI"/>
-                <w:color w:val="212529"/>
-                <w:sz w:val="18"/>
-              </w:rPr>
-              <w:t>Par de claves (Key Pair)</w:t>
-            </w:r>
-          </w:p>
-        </w:tc>
-        <w:tc>
-          <w:tcPr>
-            <w:tcW w:type="dxa" w:w="2592"/>
-            <w:shd w:fill="FFFFFF"/>
-            <w:tcMar>
-              <w:top w:w="70" w:type="dxa"/>
-              <w:bottom w:w="70" w:type="dxa"/>
-              <w:left w:w="90" w:type="dxa"/>
-              <w:right w:w="90" w:type="dxa"/>
-            </w:tcMar>
-          </w:tcPr>
-          <w:p>
-            <w:r>
-              <w:rPr>
-                <w:rFonts w:ascii="Segoe UI" w:hAnsi="Segoe UI"/>
-                <w:color w:val="212529"/>
-                <w:sz w:val="18"/>
-              </w:rPr>
-              <w:t>Clave de acceso</w:t>
-            </w:r>
-          </w:p>
-        </w:tc>
-        <w:tc>
-          <w:tcPr>
-            <w:tcW w:type="dxa" w:w="4320"/>
-            <w:shd w:fill="FFFFFF"/>
-            <w:tcMar>
-              <w:top w:w="70" w:type="dxa"/>
-              <w:bottom w:w="70" w:type="dxa"/>
-              <w:left w:w="90" w:type="dxa"/>
-              <w:right w:w="90" w:type="dxa"/>
-            </w:tcMar>
-          </w:tcPr>
-          <w:p>
-            <w:r>
-              <w:rPr>
-                <w:rFonts w:ascii="Segoe UI" w:hAnsi="Segoe UI"/>
-                <w:color w:val="212529"/>
-                <w:sz w:val="18"/>
-              </w:rPr>
-              <w:t>Crear nuevo par -&gt; Nombre: userReact, RSA, .pem</w:t>
-            </w:r>
-          </w:p>
-        </w:tc>
-      </w:tr>
-      <w:tr>
-        <w:tc>
-          <w:tcPr>
-            <w:tcW w:type="dxa" w:w="2880"/>
-            <w:shd w:fill="F8F9FA"/>
-            <w:tcMar>
-              <w:top w:w="70" w:type="dxa"/>
-              <w:bottom w:w="70" w:type="dxa"/>
-              <w:left w:w="90" w:type="dxa"/>
-              <w:right w:w="90" w:type="dxa"/>
-            </w:tcMar>
-          </w:tcPr>
-          <w:p>
-            <w:r>
-              <w:rPr>
-                <w:rFonts w:ascii="Segoe UI" w:hAnsi="Segoe UI"/>
-                <w:color w:val="212529"/>
-                <w:sz w:val="18"/>
-              </w:rPr>
-              <w:t>Configuración de red</w:t>
-            </w:r>
-          </w:p>
-        </w:tc>
-        <w:tc>
-          <w:tcPr>
-            <w:tcW w:type="dxa" w:w="2592"/>
-            <w:shd w:fill="F8F9FA"/>
-            <w:tcMar>
-              <w:top w:w="70" w:type="dxa"/>
-              <w:bottom w:w="70" w:type="dxa"/>
-              <w:left w:w="90" w:type="dxa"/>
-              <w:right w:w="90" w:type="dxa"/>
-            </w:tcMar>
-          </w:tcPr>
-          <w:p>
-            <w:r>
-              <w:rPr>
-                <w:rFonts w:ascii="Segoe UI" w:hAnsi="Segoe UI"/>
-                <w:color w:val="212529"/>
-                <w:sz w:val="18"/>
-              </w:rPr>
-              <w:t>Casillas rápidas</w:t>
-            </w:r>
-          </w:p>
-        </w:tc>
-        <w:tc>
-          <w:tcPr>
-            <w:tcW w:type="dxa" w:w="4320"/>
-            <w:shd w:fill="F8F9FA"/>
-            <w:tcMar>
-              <w:top w:w="70" w:type="dxa"/>
-              <w:bottom w:w="70" w:type="dxa"/>
-              <w:left w:w="90" w:type="dxa"/>
-              <w:right w:w="90" w:type="dxa"/>
-            </w:tcMar>
-          </w:tcPr>
-          <w:p>
-            <w:r>
-              <w:rPr>
-                <w:rFonts w:ascii="Segoe UI" w:hAnsi="Segoe UI"/>
-                <w:color w:val="212529"/>
-                <w:sz w:val="18"/>
-              </w:rPr>
-              <w:t>Marcar casillas: [x] HTTPS y [x] HTTP</w:t>
-            </w:r>
-          </w:p>
-        </w:tc>
-      </w:tr>
-      <w:tr>
-        <w:tc>
-          <w:tcPr>
-            <w:tcW w:type="dxa" w:w="2880"/>
-            <w:shd w:fill="FFFFFF"/>
-            <w:tcMar>
-              <w:top w:w="70" w:type="dxa"/>
-              <w:bottom w:w="70" w:type="dxa"/>
-              <w:left w:w="90" w:type="dxa"/>
-              <w:right w:w="90" w:type="dxa"/>
-            </w:tcMar>
-          </w:tcPr>
-          <w:p>
-            <w:r>
-              <w:rPr>
-                <w:rFonts w:ascii="Segoe UI" w:hAnsi="Segoe UI"/>
-                <w:color w:val="212529"/>
-                <w:sz w:val="18"/>
-              </w:rPr>
-              <w:t>Configuración de red</w:t>
-            </w:r>
-          </w:p>
-        </w:tc>
-        <w:tc>
-          <w:tcPr>
-            <w:tcW w:type="dxa" w:w="2592"/>
-            <w:shd w:fill="FFFFFF"/>
-            <w:tcMar>
-              <w:top w:w="70" w:type="dxa"/>
-              <w:bottom w:w="70" w:type="dxa"/>
-              <w:left w:w="90" w:type="dxa"/>
-              <w:right w:w="90" w:type="dxa"/>
-            </w:tcMar>
-          </w:tcPr>
-          <w:p>
-            <w:r>
-              <w:rPr>
-                <w:rFonts w:ascii="Segoe UI" w:hAnsi="Segoe UI"/>
-                <w:color w:val="212529"/>
-                <w:sz w:val="18"/>
-              </w:rPr>
-              <w:t>Editar reglas</w:t>
-            </w:r>
-          </w:p>
-        </w:tc>
-        <w:tc>
-          <w:tcPr>
-            <w:tcW w:type="dxa" w:w="4320"/>
-            <w:shd w:fill="FFFFFF"/>
-            <w:tcMar>
-              <w:top w:w="70" w:type="dxa"/>
-              <w:bottom w:w="70" w:type="dxa"/>
-              <w:left w:w="90" w:type="dxa"/>
-              <w:right w:w="90" w:type="dxa"/>
-            </w:tcMar>
-          </w:tcPr>
-          <w:p>
-            <w:r>
-              <w:rPr>
-                <w:rFonts w:ascii="Segoe UI" w:hAnsi="Segoe UI"/>
-                <w:color w:val="212529"/>
-                <w:sz w:val="18"/>
-              </w:rPr>
-              <w:t>Clic en Editar -&gt; Agregar regla:</w:t>
-              <w:br/>
-              <w:t>• Tipo: TCP personalizado</w:t>
-              <w:br/>
-              <w:t>• Puerto: 3000</w:t>
-              <w:br/>
-              <w:t>• Origen: Cualquier lugar (0.0.0.0/0)</w:t>
-            </w:r>
-          </w:p>
-        </w:tc>
-      </w:tr>
-      <w:tr>
-        <w:tc>
-          <w:tcPr>
-            <w:tcW w:type="dxa" w:w="2880"/>
-            <w:shd w:fill="F8F9FA"/>
-            <w:tcMar>
-              <w:top w:w="70" w:type="dxa"/>
-              <w:bottom w:w="70" w:type="dxa"/>
-              <w:left w:w="90" w:type="dxa"/>
-              <w:right w:w="90" w:type="dxa"/>
-            </w:tcMar>
-          </w:tcPr>
-          <w:p>
-            <w:r>
-              <w:rPr>
-                <w:rFonts w:ascii="Segoe UI" w:hAnsi="Segoe UI"/>
-                <w:color w:val="212529"/>
-                <w:sz w:val="18"/>
-              </w:rPr>
-              <w:t>Almacenamiento</w:t>
-            </w:r>
-          </w:p>
-        </w:tc>
-        <w:tc>
-          <w:tcPr>
-            <w:tcW w:type="dxa" w:w="2592"/>
-            <w:shd w:fill="F8F9FA"/>
-            <w:tcMar>
-              <w:top w:w="70" w:type="dxa"/>
-              <w:bottom w:w="70" w:type="dxa"/>
-              <w:left w:w="90" w:type="dxa"/>
-              <w:right w:w="90" w:type="dxa"/>
-            </w:tcMar>
-          </w:tcPr>
-          <w:p>
-            <w:r>
-              <w:rPr>
-                <w:rFonts w:ascii="Segoe UI" w:hAnsi="Segoe UI"/>
-                <w:color w:val="212529"/>
-                <w:sz w:val="18"/>
-              </w:rPr>
-              <w:t>Tamaño de disco</w:t>
-            </w:r>
-          </w:p>
-        </w:tc>
-        <w:tc>
-          <w:tcPr>
-            <w:tcW w:type="dxa" w:w="4320"/>
-            <w:shd w:fill="F8F9FA"/>
-            <w:tcMar>
-              <w:top w:w="70" w:type="dxa"/>
-              <w:bottom w:w="70" w:type="dxa"/>
-              <w:left w:w="90" w:type="dxa"/>
-              <w:right w:w="90" w:type="dxa"/>
-            </w:tcMar>
-          </w:tcPr>
-          <w:p>
-            <w:r>
-              <w:rPr>
-                <w:rFonts w:ascii="Segoe UI" w:hAnsi="Segoe UI"/>
-                <w:color w:val="212529"/>
-                <w:sz w:val="18"/>
-              </w:rPr>
-              <w:t>Cambiar de 8 GiB a 20 GiB (gp3)</w:t>
-            </w:r>
-          </w:p>
-        </w:tc>
-      </w:tr>
-    </w:tbl>
     <w:p>
-      <w:pPr>
-        <w:spacing w:after="80"/>
-      </w:pPr>
+      <w:r>
+        <w:t>1. En el panel de instancias de EC2, seleccionar la instancia reactBootstrap.</w:t>
+      </w:r>
     </w:p>
     <w:p>
-      <w:pPr>
-        <w:keepNext/>
-        <w:spacing w:before="280" w:after="120"/>
-      </w:pPr>
       <w:r>
-        <w:rPr>
-          <w:rFonts w:ascii="Segoe UI" w:hAnsi="Segoe UI"/>
-          <w:b/>
-          <w:color w:val="104B8E"/>
-          <w:sz w:val="28"/>
-        </w:rPr>
-        <w:t>3. Conectarse a la Máquina Virtual</w:t>
+        <w:t>2. Presionar el botón Connect (Conectar).</w:t>
+      </w:r>
+    </w:p>
+    <w:p>
+      <w:r>
+        <w:t>3. Seleccionar la pestaña EC2 Instance Connect y presionar Connect para abrir una sesión interactiva en el navegador.</w:t>
       </w:r>
     </w:p>
     <w:p>
       <w:pPr>
-        <w:spacing w:after="100" w:line="276" w:lineRule="auto"/>
+        <w:pStyle w:val="Heading1"/>
       </w:pPr>
       <w:r>
-        <w:rPr>
-          <w:rFonts w:ascii="Segoe UI" w:hAnsi="Segoe UI"/>
-          <w:color w:val="212529"/>
-          <w:sz w:val="20"/>
-        </w:rPr>
-        <w:t>1. En la lista de EC2 selecciona la instancia 'reactBootstrap' y haz clic en el botón 'Conectar' (arriba a la izquierda).</w:t>
+        <w:t>4. Instalación del Entorno y Ejecución en el Servidor</w:t>
+      </w:r>
+    </w:p>
+    <w:p>
+      <w:r>
+        <w:t>Ejecutar los siguientes comandos en la terminal de la instancia Ubuntu:</w:t>
       </w:r>
     </w:p>
     <w:p>
       <w:pPr>
-        <w:spacing w:after="100" w:line="276" w:lineRule="auto"/>
+        <w:pStyle w:val="Heading2"/>
       </w:pPr>
       <w:r>
-        <w:rPr>
-          <w:rFonts w:ascii="Segoe UI" w:hAnsi="Segoe UI"/>
-          <w:color w:val="212529"/>
-          <w:sz w:val="20"/>
-        </w:rPr>
-        <w:t>2. En la pestaña 'Conexión de la instancia EC2' presiona el botón 'Conectar' abajo.</w:t>
+        <w:t>4.1 Actualización de paquetes del sistema</w:t>
+      </w:r>
+    </w:p>
+    <w:p>
+      <w:r>
+        <w:t>sudo apt-get update -y</w:t>
       </w:r>
     </w:p>
     <w:p>
       <w:pPr>
-        <w:spacing w:after="100" w:line="276" w:lineRule="auto"/>
+        <w:pStyle w:val="Heading2"/>
       </w:pPr>
       <w:r>
-        <w:rPr>
-          <w:rFonts w:ascii="Segoe UI" w:hAnsi="Segoe UI"/>
-          <w:color w:val="212529"/>
-          <w:sz w:val="20"/>
-        </w:rPr>
-        <w:t>3. Se abrirá automáticamente la terminal negra de comandos de Ubuntu en tu navegador.</w:t>
+        <w:t>4.2 Instalación de Node Version Manager (NVM)</w:t>
+      </w:r>
+    </w:p>
+    <w:p>
+      <w:r>
+        <w:t>curl -o- https://raw.githubusercontent.com/nvm-sh/nvm/v0.39.3/install.sh | bash</w:t>
+        <w:br/>
+        <w:t>export NVM_DIR="$HOME/.nvm"</w:t>
+        <w:br/>
+        <w:t>[ -s "$NVM_DIR/nvm.sh" ] &amp;&amp; \. "$NVM_DIR/nvm.sh"</w:t>
       </w:r>
     </w:p>
     <w:p>
       <w:pPr>
-        <w:keepNext/>
-        <w:spacing w:before="280" w:after="120"/>
+        <w:pStyle w:val="Heading2"/>
       </w:pPr>
       <w:r>
-        <w:rPr>
-          <w:rFonts w:ascii="Segoe UI" w:hAnsi="Segoe UI"/>
-          <w:b/>
-          <w:color w:val="104B8E"/>
-          <w:sz w:val="28"/>
-        </w:rPr>
-        <w:t>4. Comandos directos en la Terminal de AWS (Pantalla Negra)</w:t>
+        <w:t>4.3 Instalación de Node.js (v22 LTS)</w:t>
+      </w:r>
+    </w:p>
+    <w:p>
+      <w:r>
+        <w:t>nvm install 22</w:t>
+        <w:br/>
+        <w:t>node -v</w:t>
+        <w:br/>
+        <w:t>npm -v</w:t>
       </w:r>
     </w:p>
     <w:p>
       <w:pPr>
-        <w:spacing w:after="100" w:line="276" w:lineRule="auto"/>
+        <w:pStyle w:val="Heading2"/>
       </w:pPr>
       <w:r>
-        <w:rPr>
-          <w:rFonts w:ascii="Segoe UI" w:hAnsi="Segoe UI"/>
-          <w:color w:val="212529"/>
-          <w:sz w:val="20"/>
-        </w:rPr>
-        <w:t>Copia y pega estos comandos uno a uno en la terminal de AWS:</w:t>
+        <w:t>4.4 Clonación del repositorio</w:t>
+      </w:r>
+    </w:p>
+    <w:p>
+      <w:r>
+        <w:t>git clone https://github.com/drkFenix/FS2_S04_G8.git</w:t>
       </w:r>
     </w:p>
     <w:p>
       <w:pPr>
-        <w:keepNext/>
-        <w:spacing w:before="200" w:after="80"/>
+        <w:pStyle w:val="Heading2"/>
       </w:pPr>
       <w:r>
-        <w:rPr>
-          <w:rFonts w:ascii="Segoe UI" w:hAnsi="Segoe UI"/>
-          <w:b/>
-          <w:color w:val="28A745"/>
-          <w:sz w:val="23"/>
-        </w:rPr>
-        <w:t>Paso 4.1: Actualizar el servidor</w:t>
+        <w:t>4.5 Instalación de dependencias del proyecto</w:t>
       </w:r>
     </w:p>
-    <w:tbl>
-      <w:tblPr>
-        <w:tblW w:type="auto" w:w="0"/>
-        <w:jc w:val="center"/>
-        <w:tblLayout w:type="fixed"/>
-        <w:tblLook w:firstColumn="1" w:firstRow="1" w:lastColumn="0" w:lastRow="0" w:noHBand="0" w:noVBand="1" w:val="04A0"/>
-      </w:tblPr>
-      <w:tblGrid>
-        <w:gridCol w:w="9792"/>
-      </w:tblGrid>
-      <w:tr>
-        <w:tc>
-          <w:tcPr>
-            <w:tcW w:type="dxa" w:w="9936"/>
-            <w:shd w:fill="1E1E1E"/>
-            <w:tcMar>
-              <w:top w:w="120" w:type="dxa"/>
-              <w:bottom w:w="120" w:type="dxa"/>
-              <w:left w:w="150" w:type="dxa"/>
-              <w:right w:w="150" w:type="dxa"/>
-            </w:tcMar>
-          </w:tcPr>
-          <w:p>
-            <w:pPr>
-              <w:spacing w:after="0" w:line="276" w:lineRule="auto"/>
-            </w:pPr>
-            <w:r>
-              <w:rPr>
-                <w:rFonts w:ascii="Consolas" w:hAnsi="Consolas"/>
-                <w:color w:val="DCDCDC"/>
-                <w:sz w:val="18"/>
-              </w:rPr>
-              <w:t>sudo apt-get update -y</w:t>
-            </w:r>
-          </w:p>
-        </w:tc>
-      </w:tr>
-    </w:tbl>
     <w:p>
-      <w:pPr>
-        <w:spacing w:after="80"/>
-      </w:pPr>
-    </w:p>
-    <w:p>
-      <w:pPr>
-        <w:keepNext/>
-        <w:spacing w:before="200" w:after="80"/>
-      </w:pPr>
       <w:r>
-        <w:rPr>
-          <w:rFonts w:ascii="Segoe UI" w:hAnsi="Segoe UI"/>
-          <w:b/>
-          <w:color w:val="28A745"/>
-          <w:sz w:val="23"/>
-        </w:rPr>
-        <w:t>Paso 4.2: Instalar el gestor de versiones NVM</w:t>
-      </w:r>
-    </w:p>
-    <w:tbl>
-      <w:tblPr>
-        <w:tblW w:type="auto" w:w="0"/>
-        <w:jc w:val="center"/>
-        <w:tblLayout w:type="fixed"/>
-        <w:tblLook w:firstColumn="1" w:firstRow="1" w:lastColumn="0" w:lastRow="0" w:noHBand="0" w:noVBand="1" w:val="04A0"/>
-      </w:tblPr>
-      <w:tblGrid>
-        <w:gridCol w:w="9792"/>
-      </w:tblGrid>
-      <w:tr>
-        <w:tc>
-          <w:tcPr>
-            <w:tcW w:type="dxa" w:w="9936"/>
-            <w:shd w:fill="1E1E1E"/>
-            <w:tcMar>
-              <w:top w:w="120" w:type="dxa"/>
-              <w:bottom w:w="120" w:type="dxa"/>
-              <w:left w:w="150" w:type="dxa"/>
-              <w:right w:w="150" w:type="dxa"/>
-            </w:tcMar>
-          </w:tcPr>
-          <w:p>
-            <w:pPr>
-              <w:spacing w:after="0" w:line="276" w:lineRule="auto"/>
-            </w:pPr>
-            <w:r>
-              <w:rPr>
-                <w:rFonts w:ascii="Consolas" w:hAnsi="Consolas"/>
-                <w:color w:val="DCDCDC"/>
-                <w:sz w:val="18"/>
-              </w:rPr>
-              <w:t>curl -o- https://raw.githubusercontent.com/nvm-sh/nvm/v0.39.3/install.sh | bash</w:t>
-              <w:br/>
-              <w:t>export NVM_DIR="$HOME/.nvm"</w:t>
-              <w:br/>
-              <w:t>[ -s "$NVM_DIR/nvm.sh" ] &amp;&amp; \. "$NVM_DIR/nvm.sh"</w:t>
-            </w:r>
-          </w:p>
-        </w:tc>
-      </w:tr>
-    </w:tbl>
-    <w:p>
-      <w:pPr>
-        <w:spacing w:after="80"/>
-      </w:pPr>
-    </w:p>
-    <w:p>
-      <w:pPr>
-        <w:keepNext/>
-        <w:spacing w:before="200" w:after="80"/>
-      </w:pPr>
-      <w:r>
-        <w:rPr>
-          <w:rFonts w:ascii="Segoe UI" w:hAnsi="Segoe UI"/>
-          <w:b/>
-          <w:color w:val="28A745"/>
-          <w:sz w:val="23"/>
-        </w:rPr>
-        <w:t>Paso 4.3: Instalar Node.js versión 22</w:t>
-      </w:r>
-    </w:p>
-    <w:tbl>
-      <w:tblPr>
-        <w:tblW w:type="auto" w:w="0"/>
-        <w:jc w:val="center"/>
-        <w:tblLayout w:type="fixed"/>
-        <w:tblLook w:firstColumn="1" w:firstRow="1" w:lastColumn="0" w:lastRow="0" w:noHBand="0" w:noVBand="1" w:val="04A0"/>
-      </w:tblPr>
-      <w:tblGrid>
-        <w:gridCol w:w="9792"/>
-      </w:tblGrid>
-      <w:tr>
-        <w:tc>
-          <w:tcPr>
-            <w:tcW w:type="dxa" w:w="9936"/>
-            <w:shd w:fill="1E1E1E"/>
-            <w:tcMar>
-              <w:top w:w="120" w:type="dxa"/>
-              <w:bottom w:w="120" w:type="dxa"/>
-              <w:left w:w="150" w:type="dxa"/>
-              <w:right w:w="150" w:type="dxa"/>
-            </w:tcMar>
-          </w:tcPr>
-          <w:p>
-            <w:pPr>
-              <w:spacing w:after="0" w:line="276" w:lineRule="auto"/>
-            </w:pPr>
-            <w:r>
-              <w:rPr>
-                <w:rFonts w:ascii="Consolas" w:hAnsi="Consolas"/>
-                <w:color w:val="DCDCDC"/>
-                <w:sz w:val="18"/>
-              </w:rPr>
-              <w:t>nvm install 22</w:t>
-              <w:br/>
-              <w:t>node -v</w:t>
-              <w:br/>
-              <w:t>npm -v</w:t>
-            </w:r>
-          </w:p>
-        </w:tc>
-      </w:tr>
-    </w:tbl>
-    <w:p>
-      <w:pPr>
-        <w:spacing w:after="80"/>
-      </w:pPr>
-    </w:p>
-    <w:p>
-      <w:pPr>
-        <w:keepNext/>
-        <w:spacing w:before="200" w:after="80"/>
-      </w:pPr>
-      <w:r>
-        <w:rPr>
-          <w:rFonts w:ascii="Segoe UI" w:hAnsi="Segoe UI"/>
-          <w:b/>
-          <w:color w:val="28A745"/>
-          <w:sz w:val="23"/>
-        </w:rPr>
-        <w:t>Paso 4.4: Clonar tu proyecto de GitHub</w:t>
-      </w:r>
-    </w:p>
-    <w:tbl>
-      <w:tblPr>
-        <w:tblW w:type="auto" w:w="0"/>
-        <w:jc w:val="center"/>
-        <w:tblLayout w:type="fixed"/>
-        <w:tblLook w:firstColumn="1" w:firstRow="1" w:lastColumn="0" w:lastRow="0" w:noHBand="0" w:noVBand="1" w:val="04A0"/>
-      </w:tblPr>
-      <w:tblGrid>
-        <w:gridCol w:w="9792"/>
-      </w:tblGrid>
-      <w:tr>
-        <w:tc>
-          <w:tcPr>
-            <w:tcW w:type="dxa" w:w="9936"/>
-            <w:shd w:fill="1E1E1E"/>
-            <w:tcMar>
-              <w:top w:w="120" w:type="dxa"/>
-              <w:bottom w:w="120" w:type="dxa"/>
-              <w:left w:w="150" w:type="dxa"/>
-              <w:right w:w="150" w:type="dxa"/>
-            </w:tcMar>
-          </w:tcPr>
-          <w:p>
-            <w:pPr>
-              <w:spacing w:after="0" w:line="276" w:lineRule="auto"/>
-            </w:pPr>
-            <w:r>
-              <w:rPr>
-                <w:rFonts w:ascii="Consolas" w:hAnsi="Consolas"/>
-                <w:color w:val="DCDCDC"/>
-                <w:sz w:val="18"/>
-              </w:rPr>
-              <w:t>git clone https://github.com/drkFenix/FS2_S04_G8.git</w:t>
-            </w:r>
-          </w:p>
-        </w:tc>
-      </w:tr>
-    </w:tbl>
-    <w:p>
-      <w:pPr>
-        <w:spacing w:after="80"/>
-      </w:pPr>
-    </w:p>
-    <w:p>
-      <w:pPr>
-        <w:keepNext/>
-        <w:spacing w:before="200" w:after="80"/>
-      </w:pPr>
-      <w:r>
-        <w:rPr>
-          <w:rFonts w:ascii="Segoe UI" w:hAnsi="Segoe UI"/>
-          <w:b/>
-          <w:color w:val="28A745"/>
-          <w:sz w:val="23"/>
-        </w:rPr>
-        <w:t>Paso 4.5: Entrar a la carpeta e instalar librerías</w:t>
-      </w:r>
-    </w:p>
-    <w:tbl>
-      <w:tblPr>
-        <w:tblW w:type="auto" w:w="0"/>
-        <w:jc w:val="center"/>
-        <w:tblLayout w:type="fixed"/>
-        <w:tblLook w:firstColumn="1" w:firstRow="1" w:lastColumn="0" w:lastRow="0" w:noHBand="0" w:noVBand="1" w:val="04A0"/>
-      </w:tblPr>
-      <w:tblGrid>
-        <w:gridCol w:w="9792"/>
-      </w:tblGrid>
-      <w:tr>
-        <w:tc>
-          <w:tcPr>
-            <w:tcW w:type="dxa" w:w="9936"/>
-            <w:shd w:fill="1E1E1E"/>
-            <w:tcMar>
-              <w:top w:w="120" w:type="dxa"/>
-              <w:bottom w:w="120" w:type="dxa"/>
-              <w:left w:w="150" w:type="dxa"/>
-              <w:right w:w="150" w:type="dxa"/>
-            </w:tcMar>
-          </w:tcPr>
-          <w:p>
-            <w:pPr>
-              <w:spacing w:after="0" w:line="276" w:lineRule="auto"/>
-            </w:pPr>
-            <w:r>
-              <w:rPr>
-                <w:rFonts w:ascii="Consolas" w:hAnsi="Consolas"/>
-                <w:color w:val="DCDCDC"/>
-                <w:sz w:val="18"/>
-              </w:rPr>
-              <w:t>cd FS2_S04_G8/huertohogar-app</w:t>
-              <w:br/>
-              <w:t>npm install</w:t>
-            </w:r>
-          </w:p>
-        </w:tc>
-      </w:tr>
-    </w:tbl>
-    <w:p>
-      <w:pPr>
-        <w:spacing w:after="80"/>
-      </w:pPr>
-    </w:p>
-    <w:p>
-      <w:pPr>
-        <w:keepNext/>
-        <w:spacing w:before="200" w:after="80"/>
-      </w:pPr>
-      <w:r>
-        <w:rPr>
-          <w:rFonts w:ascii="Segoe UI" w:hAnsi="Segoe UI"/>
-          <w:b/>
-          <w:color w:val="28A745"/>
-          <w:sz w:val="23"/>
-        </w:rPr>
-        <w:t>Paso 4.6: Dejar la aplicación corriendo permanentemente con PM2</w:t>
+        <w:t>cd FS2_S04_G8/huertohogar-app</w:t>
+        <w:br/>
+        <w:t>npm install</w:t>
       </w:r>
     </w:p>
     <w:p>
       <w:pPr>
-        <w:spacing w:after="100" w:line="276" w:lineRule="auto"/>
+        <w:pStyle w:val="Heading2"/>
       </w:pPr>
       <w:r>
-        <w:rPr>
-          <w:rFonts w:ascii="Segoe UI" w:hAnsi="Segoe UI"/>
-          <w:b/>
-          <w:color w:val="212529"/>
-          <w:sz w:val="20"/>
-        </w:rPr>
-        <w:t xml:space="preserve">Ejecución continua: </w:t>
-      </w:r>
-      <w:r>
-        <w:rPr>
-          <w:rFonts w:ascii="Segoe UI" w:hAnsi="Segoe UI"/>
-          <w:color w:val="212529"/>
-          <w:sz w:val="20"/>
-        </w:rPr>
-        <w:t>Con PM2 la aplicación se mantiene en ejecución en segundo plano aunque cierres la ventana:</w:t>
+        <w:t>4.6 Gestión y ejecución del proceso con PM2</w:t>
       </w:r>
     </w:p>
-    <w:tbl>
-      <w:tblPr>
-        <w:tblW w:type="auto" w:w="0"/>
-        <w:jc w:val="center"/>
-        <w:tblLayout w:type="fixed"/>
-        <w:tblLook w:firstColumn="1" w:firstRow="1" w:lastColumn="0" w:lastRow="0" w:noHBand="0" w:noVBand="1" w:val="04A0"/>
-      </w:tblPr>
-      <w:tblGrid>
-        <w:gridCol w:w="9792"/>
-      </w:tblGrid>
-      <w:tr>
-        <w:tc>
-          <w:tcPr>
-            <w:tcW w:type="dxa" w:w="9936"/>
-            <w:shd w:fill="1E1E1E"/>
-            <w:tcMar>
-              <w:top w:w="120" w:type="dxa"/>
-              <w:bottom w:w="120" w:type="dxa"/>
-              <w:left w:w="150" w:type="dxa"/>
-              <w:right w:w="150" w:type="dxa"/>
-            </w:tcMar>
-          </w:tcPr>
-          <w:p>
-            <w:pPr>
-              <w:spacing w:after="0" w:line="276" w:lineRule="auto"/>
-            </w:pPr>
-            <w:r>
-              <w:rPr>
-                <w:rFonts w:ascii="Consolas" w:hAnsi="Consolas"/>
-                <w:color w:val="DCDCDC"/>
-                <w:sz w:val="18"/>
-              </w:rPr>
-              <w:t>npm install -g pm2</w:t>
-              <w:br/>
-              <w:t>pm2 start "npm start" --name "huertohogar"</w:t>
-            </w:r>
-          </w:p>
-        </w:tc>
-      </w:tr>
-    </w:tbl>
     <w:p>
-      <w:pPr>
-        <w:spacing w:after="80"/>
-      </w:pPr>
-    </w:p>
-    <w:p>
-      <w:pPr>
-        <w:keepNext/>
-        <w:spacing w:before="280" w:after="120"/>
-      </w:pPr>
       <w:r>
-        <w:rPr>
-          <w:rFonts w:ascii="Segoe UI" w:hAnsi="Segoe UI"/>
-          <w:b/>
-          <w:color w:val="104B8E"/>
-          <w:sz w:val="28"/>
-        </w:rPr>
-        <w:t>5. Abrir la Aplicación en el Navegador</w:t>
+        <w:t>npm install -g pm2</w:t>
+        <w:br/>
+        <w:t>pm2 start "npm start" --name "huertohogar"</w:t>
       </w:r>
     </w:p>
     <w:p>
       <w:pPr>
-        <w:spacing w:after="100" w:line="276" w:lineRule="auto"/>
+        <w:pStyle w:val="Heading1"/>
       </w:pPr>
       <w:r>
-        <w:rPr>
-          <w:rFonts w:ascii="Segoe UI" w:hAnsi="Segoe UI"/>
-          <w:color w:val="212529"/>
-          <w:sz w:val="20"/>
-        </w:rPr>
-        <w:t>Copia la IP pública que aparece en el panel de AWS (o en la barra inferior de la terminal) y ábrela en tu navegador:</w:t>
+        <w:t>5. Acceso y Verificación del Servicio</w:t>
       </w:r>
     </w:p>
-    <w:tbl>
-      <w:tblPr>
-        <w:tblW w:type="auto" w:w="0"/>
-        <w:jc w:val="center"/>
-        <w:tblLayout w:type="fixed"/>
-        <w:tblLook w:firstColumn="1" w:firstRow="1" w:lastColumn="0" w:lastRow="0" w:noHBand="0" w:noVBand="1" w:val="04A0"/>
-      </w:tblPr>
-      <w:tblGrid>
-        <w:gridCol w:w="9792"/>
-      </w:tblGrid>
-      <w:tr>
-        <w:tc>
-          <w:tcPr>
-            <w:tcW w:type="dxa" w:w="9936"/>
-            <w:shd w:fill="D4EDDA"/>
-            <w:tcMar>
-              <w:top w:w="120" w:type="dxa"/>
-              <w:bottom w:w="120" w:type="dxa"/>
-              <w:left w:w="150" w:type="dxa"/>
-              <w:right w:w="150" w:type="dxa"/>
-            </w:tcMar>
-          </w:tcPr>
-          <w:p>
-            <w:pPr>
-              <w:spacing w:after="40"/>
-            </w:pPr>
-            <w:r>
-              <w:rPr>
-                <w:rFonts w:ascii="Segoe UI" w:hAnsi="Segoe UI"/>
-                <w:b/>
-                <w:color w:val="104B8E"/>
-                <w:sz w:val="19"/>
-              </w:rPr>
-              <w:t xml:space="preserve">📌 ENLACE DE ACCESO: </w:t>
-            </w:r>
-            <w:r>
-              <w:rPr>
-                <w:rFonts w:ascii="Segoe UI" w:hAnsi="Segoe UI"/>
-                <w:color w:val="212529"/>
-                <w:sz w:val="19"/>
-              </w:rPr>
-              <w:t>http://TU-IP-PUBLICA:3000</w:t>
-              <w:br/>
-              <w:t>Ejemplo: http://34.230.35.62:3000</w:t>
-              <w:br/>
-              <w:br/>
-              <w:t>❌ INCORRECTO: https://34.230.35.62:3000 (dará error ERR_SSL_PROTOCOL_ERROR)</w:t>
-              <w:br/>
-              <w:t>✅ CORRECTO:   http://34.230.35.62:3000 (sin la letra 's')</w:t>
-            </w:r>
-          </w:p>
-        </w:tc>
-      </w:tr>
-    </w:tbl>
     <w:p>
-      <w:pPr>
-        <w:spacing w:after="80"/>
-      </w:pPr>
+      <w:r>
+        <w:t>Una vez iniciado el proceso en PM2, abrir en el navegador web:</w:t>
+        <w:br/>
+        <w:t>http://&lt;IP_PUBLICA_EC2&gt;:3000</w:t>
+      </w:r>
+    </w:p>
+    <w:p>
+      <w:r>
+        <w:t>Nota: La instancia utiliza protocolo HTTP directo en el puerto 3000 (http://), no HTTPS (https://), a menos que se configure previamente un certificado SSL y un reverse proxy como Nginx.</w:t>
+      </w:r>
     </w:p>
     <w:sectPr>
       <w:pgSz w:w="12240" w:h="15840"/>
-      <w:pgMar w:top="1152" w:right="1152" w:bottom="1152" w:left="1152" w:header="720" w:footer="720" w:gutter="0"/>
+      <w:pgMar w:top="1440" w:right="1800" w:bottom="1440" w:left="1800" w:header="720" w:footer="720" w:gutter="0"/>
       <w:cols w:space="720"/>
       <w:docGrid w:linePitch="360"/>
     </w:sectPr>

</xml_diff>